<commit_message>
Master questions and AgentDev: all 18 tools with passing tests
</commit_message>
<xml_diff>
--- a/DM2026-Lab1-Master-Questions.docx
+++ b/DM2026-Lab1-Master-Questions.docx
@@ -1,6 +1,6 @@
 
 <file path=word/document.xml><?xml version="1.0" encoding="utf-8"?>
-<w:document xmlns:wpc="http://schemas.microsoft.com/office/word/2010/wordprocessingCanvas" xmlns:cx="http://schemas.microsoft.com/office/drawing/2014/chartex" xmlns:cx1="http://schemas.microsoft.com/office/drawing/2015/9/8/chartex" xmlns:cx2="http://schemas.microsoft.com/office/drawing/2015/10/21/chartex" xmlns:cx3="http://schemas.microsoft.com/office/drawing/2016/5/9/chartex" xmlns:cx4="http://schemas.microsoft.com/office/drawing/2016/5/10/chartex" xmlns:cx5="http://schemas.microsoft.com/office/drawing/2016/5/11/chartex" xmlns:cx6="http://schemas.microsoft.com/office/drawing/2016/5/12/chartex" xmlns:cx7="http://schemas.microsoft.com/office/drawing/2016/5/13/chartex" xmlns:cx8="http://schemas.microsoft.com/office/drawing/2016/5/14/chartex" xmlns:mc="http://schemas.openxmlformats.org/markup-compatibility/2006" xmlns:aink="http://schemas.microsoft.com/office/drawing/2016/ink" xmlns:am3d="http://schemas.microsoft.com/office/drawing/2017/model3d" xmlns:o="urn:schemas-microsoft-com:office:office" xmlns:oel="http://schemas.microsoft.com/office/2019/extlst" xmlns:r="http://schemas.openxmlformats.org/officeDocument/2006/relationships" xmlns:m="http://schemas.openxmlformats.org/officeDocument/2006/math" xmlns:v="urn:schemas-microsoft-com:vml" xmlns:wp14="http://schemas.microsoft.com/office/word/2010/wordprocessingDrawing" xmlns:wp="http://schemas.openxmlformats.org/drawingml/2006/wordprocessingDrawing" xmlns:w10="urn:schemas-microsoft-com:office:word" xmlns:w="http://schemas.openxmlformats.org/wordprocessingml/2006/main" xmlns:w14="http://schemas.microsoft.com/office/word/2010/wordml" xmlns:w15="http://schemas.microsoft.com/office/word/2012/wordml" xmlns:w16cex="http://schemas.microsoft.com/office/word/2018/wordml/cex" xmlns:w16cid="http://schemas.microsoft.com/office/word/2016/wordml/cid" xmlns:w16="http://schemas.microsoft.com/office/word/2018/wordml" xmlns:w16du="http://schemas.microsoft.com/office/word/2023/wordml/word16du" xmlns:w16sdtdh="http://schemas.microsoft.com/office/word/2020/wordml/sdtdatahash" xmlns:w16sdtfl="http://schemas.microsoft.com/office/word/2024/wordml/sdtformatlock" xmlns:w16se="http://schemas.microsoft.com/office/word/2015/wordml/symex" xmlns:wpg="http://schemas.microsoft.com/office/word/2010/wordprocessingGroup" xmlns:wpi="http://schemas.microsoft.com/office/word/2010/wordprocessingInk" xmlns:wne="http://schemas.microsoft.com/office/word/2006/wordml" xmlns:wps="http://schemas.microsoft.com/office/word/2010/wordprocessingShape" mc:Ignorable="w14 w15 w16se w16cid w16 w16cex w16sdtdh w16sdtfl w16du wp14">
+<w:document xmlns:wpc="http://schemas.microsoft.com/office/word/2010/wordprocessingCanvas" xmlns:cx="http://schemas.microsoft.com/office/drawing/2014/chartex" xmlns:cx1="http://schemas.microsoft.com/office/drawing/2015/9/8/chartex" xmlns:cx2="http://schemas.microsoft.com/office/drawing/2015/10/21/chartex" xmlns:cx3="http://schemas.microsoft.com/office/drawing/2016/5/9/chartex" xmlns:cx4="http://schemas.microsoft.com/office/drawing/2016/5/10/chartex" xmlns:cx5="http://schemas.microsoft.com/office/drawing/2016/5/11/chartex" xmlns:cx6="http://schemas.microsoft.com/office/drawing/2016/5/12/chartex" xmlns:cx7="http://schemas.microsoft.com/office/drawing/2016/5/13/chartex" xmlns:cx8="http://schemas.microsoft.com/office/drawing/2016/5/14/chartex" xmlns:mc="http://schemas.openxmlformats.org/markup-compatibility/2006" xmlns:aink="http://schemas.microsoft.com/office/drawing/2016/ink" xmlns:am3d="http://schemas.microsoft.com/office/drawing/2017/model3d" xmlns:o="urn:schemas-microsoft-com:office:office" xmlns:oel="http://schemas.microsoft.com/office/2019/extlst" xmlns:r="http://schemas.openxmlformats.org/officeDocument/2006/relationships" xmlns:m="http://schemas.openxmlformats.org/officeDocument/2006/math" xmlns:v="urn:schemas-microsoft-com:vml" xmlns:wp14="http://schemas.microsoft.com/office/word/2010/wordprocessingDrawing" xmlns:wp="http://schemas.openxmlformats.org/drawingml/2006/wordprocessingDrawing" xmlns:w10="urn:schemas-microsoft-com:office:word" xmlns:w="http://schemas.openxmlformats.org/wordprocessingml/2006/main" xmlns:w14="http://schemas.microsoft.com/office/word/2010/wordml" xmlns:w15="http://schemas.microsoft.com/office/word/2012/wordml" xmlns:w16cex="http://schemas.microsoft.com/office/word/2018/wordml/cex" xmlns:w16cid="http://schemas.microsoft.com/office/word/2016/wordml/cid" xmlns:w16="http://schemas.microsoft.com/office/word/2018/wordml" xmlns:w16sdtdh="http://schemas.microsoft.com/office/word/2020/wordml/sdtdatahash" xmlns:w16se="http://schemas.microsoft.com/office/word/2015/wordml/symex" xmlns:wpg="http://schemas.microsoft.com/office/word/2010/wordprocessingGroup" xmlns:wpi="http://schemas.microsoft.com/office/word/2010/wordprocessingInk" xmlns:wne="http://schemas.microsoft.com/office/word/2006/wordml" xmlns:wps="http://schemas.microsoft.com/office/word/2010/wordprocessingShape" mc:Ignorable="w14 w15 w16se w16cid w16 w16cex w16sdtdh wp14">
   <w:body>
     <w:p>
       <w:pPr>
@@ -215,6 +215,14 @@
         </w:rPr>
         <w:t>Chinese Name:</w:t>
       </w:r>
+      <w:r>
+        <w:rPr>
+          <w:rFonts w:ascii="Century Schoolbook" w:hAnsi="Century Schoolbook" w:hint="eastAsia"/>
+          <w:b/>
+          <w:bCs/>
+        </w:rPr>
+        <w:t>林韋澔</w:t>
+      </w:r>
     </w:p>
     <w:p>
       <w:pPr>
@@ -235,6 +243,24 @@
         </w:rPr>
         <w:t>Email:</w:t>
       </w:r>
+      <w:r>
+        <w:rPr>
+          <w:rFonts w:ascii="Segoe UI" w:hAnsi="Segoe UI" w:cs="Segoe UI"/>
+          <w:color w:val="242424"/>
+          <w:sz w:val="21"/>
+          <w:szCs w:val="21"/>
+          <w:shd w:val="clear" w:color="auto" w:fill="F5F5F5"/>
+        </w:rPr>
+        <w:t xml:space="preserve"> </w:t>
+      </w:r>
+      <w:r>
+        <w:rPr>
+          <w:rFonts w:ascii="Century Schoolbook" w:hAnsi="Century Schoolbook"/>
+          <w:b/>
+          <w:bCs/>
+        </w:rPr>
+        <w:t>415155294@cloud.fju.edu.tw</w:t>
+      </w:r>
     </w:p>
     <w:p>
       <w:pPr>
@@ -255,6 +281,22 @@
         </w:rPr>
         <w:t>Student ID:</w:t>
       </w:r>
+      <w:r>
+        <w:rPr>
+          <w:rFonts w:ascii="Century Schoolbook" w:hAnsi="Century Schoolbook"/>
+          <w:b/>
+          <w:bCs/>
+        </w:rPr>
+        <w:t xml:space="preserve"> </w:t>
+      </w:r>
+      <w:r>
+        <w:rPr>
+          <w:rFonts w:ascii="Century Schoolbook" w:hAnsi="Century Schoolbook"/>
+          <w:b/>
+          <w:bCs/>
+        </w:rPr>
+        <w:t>415155294</w:t>
+      </w:r>
     </w:p>
     <w:p>
       <w:pPr>
@@ -274,6 +316,24 @@
           <w:bCs/>
         </w:rPr>
         <w:t>University:</w:t>
+      </w:r>
+      <w:r>
+        <w:rPr>
+          <w:rFonts w:ascii="Verdana" w:hAnsi="Verdana"/>
+          <w:color w:val="333333"/>
+          <w:sz w:val="19"/>
+          <w:szCs w:val="19"/>
+          <w:shd w:val="clear" w:color="auto" w:fill="FFFFFF"/>
+        </w:rPr>
+        <w:t xml:space="preserve"> </w:t>
+      </w:r>
+      <w:r>
+        <w:rPr>
+          <w:rFonts w:ascii="Century Schoolbook" w:hAnsi="Century Schoolbook"/>
+          <w:b/>
+          <w:bCs/>
+        </w:rPr>
+        <w:t>Fu Jen Catholic University</w:t>
       </w:r>
     </w:p>
     <w:p>
@@ -937,7 +997,7 @@
     </w:p>
     <w:p>
       <w:pPr>
-        <w:pStyle w:val="ListParagraph"/>
+        <w:pStyle w:val="a9"/>
         <w:numPr>
           <w:ilvl w:val="0"/>
           <w:numId w:val="15"/>
@@ -978,16 +1038,16 @@
     </w:p>
     <w:p>
       <w:pPr>
-        <w:pStyle w:val="ListParagraph"/>
-        <w:jc w:val="both"/>
-        <w:rPr>
-          <w:rFonts w:ascii="Century Schoolbook" w:hAnsi="Century Schoolbook"/>
-        </w:rPr>
-      </w:pPr>
-    </w:p>
-    <w:p>
-      <w:pPr>
-        <w:pStyle w:val="ListParagraph"/>
+        <w:pStyle w:val="a9"/>
+        <w:jc w:val="both"/>
+        <w:rPr>
+          <w:rFonts w:ascii="Century Schoolbook" w:hAnsi="Century Schoolbook"/>
+        </w:rPr>
+      </w:pPr>
+    </w:p>
+    <w:p>
+      <w:pPr>
+        <w:pStyle w:val="a9"/>
         <w:numPr>
           <w:ilvl w:val="0"/>
           <w:numId w:val="15"/>
@@ -1042,16 +1102,16 @@
     </w:p>
     <w:p>
       <w:pPr>
-        <w:pStyle w:val="ListParagraph"/>
-        <w:jc w:val="both"/>
-        <w:rPr>
-          <w:rFonts w:ascii="Century Schoolbook" w:hAnsi="Century Schoolbook"/>
-        </w:rPr>
-      </w:pPr>
-    </w:p>
-    <w:p>
-      <w:pPr>
-        <w:pStyle w:val="ListParagraph"/>
+        <w:pStyle w:val="a9"/>
+        <w:jc w:val="both"/>
+        <w:rPr>
+          <w:rFonts w:ascii="Century Schoolbook" w:hAnsi="Century Schoolbook"/>
+        </w:rPr>
+      </w:pPr>
+    </w:p>
+    <w:p>
+      <w:pPr>
+        <w:pStyle w:val="a9"/>
         <w:numPr>
           <w:ilvl w:val="0"/>
           <w:numId w:val="15"/>
@@ -1087,21 +1147,7 @@
         <w:rPr>
           <w:rFonts w:ascii="Century Schoolbook" w:hAnsi="Century Schoolbook"/>
         </w:rPr>
-        <w:t xml:space="preserve"> or leave it blank only if you truly did not use AI for that question. References are still encouraged if you </w:t>
-      </w:r>
-      <w:proofErr w:type="gramStart"/>
-      <w:r>
-        <w:rPr>
-          <w:rFonts w:ascii="Century Schoolbook" w:hAnsi="Century Schoolbook"/>
-        </w:rPr>
-        <w:t>looked</w:t>
-      </w:r>
-      <w:proofErr w:type="gramEnd"/>
-      <w:r>
-        <w:rPr>
-          <w:rFonts w:ascii="Century Schoolbook" w:hAnsi="Century Schoolbook"/>
-        </w:rPr>
-        <w:t xml:space="preserve"> anything up.</w:t>
+        <w:t xml:space="preserve"> or leave it blank only if you truly did not use AI for that question. References are still encouraged if you looked anything up.</w:t>
       </w:r>
     </w:p>
     <w:p>
@@ -1492,6 +1538,8 @@
         <w:jc w:val="both"/>
         <w:rPr>
           <w:rFonts w:ascii="Century Schoolbook" w:hAnsi="Century Schoolbook"/>
+          <w:b/>
+          <w:bCs/>
         </w:rPr>
       </w:pPr>
       <w:r>
@@ -1508,6 +1556,61 @@
         <w:jc w:val="both"/>
         <w:rPr>
           <w:rFonts w:ascii="Century Schoolbook" w:hAnsi="Century Schoolbook"/>
+          <w:b/>
+          <w:bCs/>
+        </w:rPr>
+      </w:pPr>
+      <w:r>
+        <w:rPr>
+          <w:rFonts w:ascii="Century Schoolbook" w:hAnsi="Century Schoolbook" w:hint="eastAsia"/>
+          <w:b/>
+          <w:bCs/>
+        </w:rPr>
+        <w:t>1.594</w:t>
+      </w:r>
+    </w:p>
+    <w:p>
+      <w:pPr>
+        <w:jc w:val="both"/>
+        <w:rPr>
+          <w:rFonts w:ascii="Century Schoolbook" w:hAnsi="Century Schoolbook"/>
+        </w:rPr>
+      </w:pPr>
+      <w:r>
+        <w:rPr>
+          <w:rFonts w:ascii="Century Schoolbook" w:hAnsi="Century Schoolbook" w:hint="eastAsia"/>
+        </w:rPr>
+        <w:t>2.</w:t>
+      </w:r>
+      <w:r>
+        <w:t xml:space="preserve"> </w:t>
+      </w:r>
+      <w:r>
+        <w:rPr>
+          <w:rFonts w:ascii="Century Schoolbook" w:hAnsi="Century Schoolbook"/>
+        </w:rPr>
+        <w:t xml:space="preserve">If all four categories are mixed together, frequent pattern mining mostly finds general words that appear in every category. Medical terms only appear in about 25% of the documents, so they are unlikely to reach the minimum support threshold and be treated as frequent. By isolating the </w:t>
+      </w:r>
+      <w:proofErr w:type="spellStart"/>
+      <w:r>
+        <w:rPr>
+          <w:rFonts w:ascii="Century Schoolbook" w:hAnsi="Century Schoolbook"/>
+        </w:rPr>
+        <w:t>sci.med</w:t>
+      </w:r>
+      <w:proofErr w:type="spellEnd"/>
+      <w:r>
+        <w:rPr>
+          <w:rFonts w:ascii="Century Schoolbook" w:hAnsi="Century Schoolbook"/>
+        </w:rPr>
+        <w:t xml:space="preserve"> category first, we can find patterns that show what medical documents mainly discuss.</w:t>
+      </w:r>
+    </w:p>
+    <w:p>
+      <w:pPr>
+        <w:jc w:val="both"/>
+        <w:rPr>
+          <w:rFonts w:ascii="Century Schoolbook" w:hAnsi="Century Schoolbook"/>
         </w:rPr>
       </w:pPr>
       <w:r>
@@ -1522,7 +1625,19 @@
         <w:rPr>
           <w:rFonts w:ascii="Century Schoolbook" w:hAnsi="Century Schoolbook"/>
         </w:rPr>
-        <w:t xml:space="preserve"> Yes / No </w:t>
+        <w:t xml:space="preserve"> </w:t>
+      </w:r>
+      <w:r>
+        <w:rPr>
+          <w:rFonts w:ascii="Century Schoolbook" w:hAnsi="Century Schoolbook" w:hint="eastAsia"/>
+        </w:rPr>
+        <w:t>YES</w:t>
+      </w:r>
+      <w:r>
+        <w:rPr>
+          <w:rFonts w:ascii="Century Schoolbook" w:hAnsi="Century Schoolbook"/>
+        </w:rPr>
+        <w:t xml:space="preserve"> </w:t>
       </w:r>
     </w:p>
     <w:p>
@@ -1546,6 +1661,12 @@
         </w:rPr>
         <w:t xml:space="preserve"> </w:t>
       </w:r>
+      <w:r>
+        <w:rPr>
+          <w:rFonts w:ascii="Century Schoolbook" w:hAnsi="Century Schoolbook"/>
+        </w:rPr>
+        <w:t>translating my ideas into English</w:t>
+      </w:r>
     </w:p>
     <w:p>
       <w:pPr>
@@ -1567,6 +1688,12 @@
           <w:rFonts w:ascii="Century Schoolbook" w:hAnsi="Century Schoolbook"/>
         </w:rPr>
         <w:t xml:space="preserve"> </w:t>
+      </w:r>
+      <w:r>
+        <w:rPr>
+          <w:rFonts w:ascii="Century Schoolbook" w:hAnsi="Century Schoolbook"/>
+        </w:rPr>
+        <w:t>https://en.wikipedia.org/wiki/Association_rule_learning</w:t>
       </w:r>
     </w:p>
     <w:p>
@@ -1624,21 +1751,137 @@
         </w:rPr>
         <w:t xml:space="preserve"> Section 4.1 — Question 2 (take home) (after the </w:t>
       </w:r>
-      <w:proofErr w:type="gramStart"/>
-      <w:r>
-        <w:rPr>
-          <w:rFonts w:ascii="Century Schoolbook" w:hAnsi="Century Schoolbook"/>
-          <w:b/>
-          <w:bCs/>
-        </w:rPr>
-        <w:t>dropna(</w:t>
-      </w:r>
-      <w:proofErr w:type="gramEnd"/>
-      <w:r>
-        <w:rPr>
-          <w:rFonts w:ascii="Century Schoolbook" w:hAnsi="Century Schoolbook"/>
-          <w:b/>
-          <w:bCs/>
+      <w:r>
+        <w:rPr>
+          <w:rFonts w:ascii="Century Schoolbook" w:hAnsi="Century Schoolbook"/>
+          <w:b/>
+          <w:bCs/>
+        </w:rPr>
+        <w:t>dropna()</w:t>
+      </w:r>
+      <w:r>
+        <w:rPr>
+          <w:rFonts w:ascii="Century Schoolbook" w:hAnsi="Century Schoolbook"/>
+        </w:rPr>
+        <w:t xml:space="preserve"> demonstration)</w:t>
+      </w:r>
+    </w:p>
+    <w:p>
+      <w:pPr>
+        <w:jc w:val="both"/>
+        <w:rPr>
+          <w:rFonts w:ascii="Century Schoolbook" w:hAnsi="Century Schoolbook"/>
+        </w:rPr>
+      </w:pPr>
+      <w:r>
+        <w:rPr>
+          <w:rFonts w:ascii="Century Schoolbook" w:hAnsi="Century Schoolbook"/>
+          <w:b/>
+          <w:bCs/>
+        </w:rPr>
+        <w:t>Task:</w:t>
+      </w:r>
+      <w:r>
+        <w:rPr>
+          <w:rFonts w:ascii="Century Schoolbook" w:hAnsi="Century Schoolbook"/>
+        </w:rPr>
+        <w:t xml:space="preserve"> </w:t>
+      </w:r>
+      <w:r>
+        <w:rPr>
+          <w:rFonts w:ascii="Century Schoolbook" w:hAnsi="Century Schoolbook"/>
+        </w:rPr>
+        <w:t xml:space="preserve">In Section 4.1, a dummy record with a missing value is injected and then removed using the </w:t>
+      </w:r>
+      <w:proofErr w:type="spellStart"/>
+      <w:r>
+        <w:rPr>
+          <w:rFonts w:ascii="Century Schoolbook" w:hAnsi="Century Schoolbook"/>
+          <w:b/>
+          <w:bCs/>
+        </w:rPr>
+        <w:t>dropna</w:t>
+      </w:r>
+      <w:proofErr w:type="spellEnd"/>
+      <w:r>
+        <w:rPr>
+          <w:rFonts w:ascii="Century Schoolbook" w:hAnsi="Century Schoolbook"/>
+          <w:b/>
+          <w:bCs/>
+        </w:rPr>
+        <w:t>()</w:t>
+      </w:r>
+      <w:r>
+        <w:rPr>
+          <w:rFonts w:ascii="Century Schoolbook" w:hAnsi="Century Schoolbook"/>
+        </w:rPr>
+        <w:t xml:space="preserve"> function.</w:t>
+      </w:r>
+    </w:p>
+    <w:p>
+      <w:pPr>
+        <w:jc w:val="both"/>
+        <w:rPr>
+          <w:rFonts w:ascii="Century Schoolbook" w:hAnsi="Century Schoolbook"/>
+        </w:rPr>
+      </w:pPr>
+      <w:r>
+        <w:rPr>
+          <w:rFonts w:ascii="Century Schoolbook" w:hAnsi="Century Schoolbook"/>
+          <w:b/>
+          <w:bCs/>
+        </w:rPr>
+        <w:t>Question:</w:t>
+      </w:r>
+      <w:r>
+        <w:rPr>
+          <w:rFonts w:ascii="Century Schoolbook" w:hAnsi="Century Schoolbook"/>
+        </w:rPr>
+        <w:t xml:space="preserve"> If 40% of documents were missing the </w:t>
+      </w:r>
+      <w:proofErr w:type="spellStart"/>
+      <w:r>
+        <w:rPr>
+          <w:rFonts w:ascii="Century Schoolbook" w:hAnsi="Century Schoolbook"/>
+          <w:b/>
+          <w:bCs/>
+        </w:rPr>
+        <w:t>category_name</w:t>
+      </w:r>
+      <w:proofErr w:type="spellEnd"/>
+      <w:r>
+        <w:rPr>
+          <w:rFonts w:ascii="Century Schoolbook" w:hAnsi="Century Schoolbook"/>
+        </w:rPr>
+        <w:t xml:space="preserve"> label, why would simply dropping these rows (</w:t>
+      </w:r>
+      <w:r>
+        <w:rPr>
+          <w:rFonts w:ascii="Century Schoolbook" w:hAnsi="Century Schoolbook"/>
+        </w:rPr>
+        <w:t xml:space="preserve">with </w:t>
+      </w:r>
+      <w:proofErr w:type="spellStart"/>
+      <w:r>
+        <w:rPr>
+          <w:rFonts w:ascii="Century Schoolbook" w:hAnsi="Century Schoolbook"/>
+          <w:b/>
+          <w:bCs/>
+        </w:rPr>
+        <w:t>dropna</w:t>
+      </w:r>
+      <w:proofErr w:type="spellEnd"/>
+      <w:r>
+        <w:rPr>
+          <w:rFonts w:ascii="Century Schoolbook" w:hAnsi="Century Schoolbook"/>
+          <w:b/>
+          <w:bCs/>
+        </w:rPr>
+        <w:t>()</w:t>
+      </w:r>
+      <w:r>
+        <w:rPr>
+          <w:rFonts w:ascii="Century Schoolbook" w:hAnsi="Century Schoolbook"/>
         </w:rPr>
         <w:t>)</w:t>
       </w:r>
@@ -1646,38 +1889,36 @@
         <w:rPr>
           <w:rFonts w:ascii="Century Schoolbook" w:hAnsi="Century Schoolbook"/>
         </w:rPr>
-        <w:t xml:space="preserve"> demonstration)</w:t>
-      </w:r>
-    </w:p>
-    <w:p>
-      <w:pPr>
-        <w:jc w:val="both"/>
-        <w:rPr>
-          <w:rFonts w:ascii="Century Schoolbook" w:hAnsi="Century Schoolbook"/>
-        </w:rPr>
-      </w:pPr>
-      <w:r>
-        <w:rPr>
-          <w:rFonts w:ascii="Century Schoolbook" w:hAnsi="Century Schoolbook"/>
-          <w:b/>
-          <w:bCs/>
-        </w:rPr>
-        <w:t>Task:</w:t>
-      </w:r>
-      <w:r>
-        <w:rPr>
-          <w:rFonts w:ascii="Century Schoolbook" w:hAnsi="Century Schoolbook"/>
-        </w:rPr>
+        <w:t xml:space="preserve"> be a flawed data mining strategy? Name one objective alternative so the text data can still be utilized.</w:t>
+      </w:r>
+    </w:p>
+    <w:p>
+      <w:pPr>
+        <w:jc w:val="both"/>
+        <w:rPr>
+          <w:rFonts w:ascii="Century Schoolbook" w:hAnsi="Century Schoolbook"/>
+        </w:rPr>
+      </w:pPr>
+      <w:r>
+        <w:rPr>
+          <w:rFonts w:ascii="Century Schoolbook" w:hAnsi="Century Schoolbook"/>
+          <w:b/>
+          <w:bCs/>
+        </w:rPr>
+        <w:t>Answer:</w:t>
+      </w:r>
+      <w:r>
         <w:t xml:space="preserve"> </w:t>
       </w:r>
       <w:r>
         <w:rPr>
           <w:rFonts w:ascii="Century Schoolbook" w:hAnsi="Century Schoolbook"/>
-        </w:rPr>
-        <w:t xml:space="preserve">In Section 4.1, a dummy record with a missing value is injected and then removed using the </w:t>
+          <w:b/>
+          <w:bCs/>
+        </w:rPr>
+        <w:t xml:space="preserve">Dropping these rows with </w:t>
       </w:r>
       <w:proofErr w:type="spellStart"/>
-      <w:proofErr w:type="gramStart"/>
       <w:r>
         <w:rPr>
           <w:rFonts w:ascii="Century Schoolbook" w:hAnsi="Century Schoolbook"/>
@@ -1693,122 +1934,7 @@
           <w:b/>
           <w:bCs/>
         </w:rPr>
-        <w:t>(</w:t>
-      </w:r>
-      <w:proofErr w:type="gramEnd"/>
-      <w:r>
-        <w:rPr>
-          <w:rFonts w:ascii="Century Schoolbook" w:hAnsi="Century Schoolbook"/>
-          <w:b/>
-          <w:bCs/>
-        </w:rPr>
-        <w:t>)</w:t>
-      </w:r>
-      <w:r>
-        <w:rPr>
-          <w:rFonts w:ascii="Century Schoolbook" w:hAnsi="Century Schoolbook"/>
-        </w:rPr>
-        <w:t xml:space="preserve"> function.</w:t>
-      </w:r>
-    </w:p>
-    <w:p>
-      <w:pPr>
-        <w:jc w:val="both"/>
-        <w:rPr>
-          <w:rFonts w:ascii="Century Schoolbook" w:hAnsi="Century Schoolbook"/>
-        </w:rPr>
-      </w:pPr>
-      <w:r>
-        <w:rPr>
-          <w:rFonts w:ascii="Century Schoolbook" w:hAnsi="Century Schoolbook"/>
-          <w:b/>
-          <w:bCs/>
-        </w:rPr>
-        <w:t>Question:</w:t>
-      </w:r>
-      <w:r>
-        <w:rPr>
-          <w:rFonts w:ascii="Century Schoolbook" w:hAnsi="Century Schoolbook"/>
-        </w:rPr>
-        <w:t xml:space="preserve"> If 40% of documents were missing the </w:t>
-      </w:r>
-      <w:proofErr w:type="spellStart"/>
-      <w:r>
-        <w:rPr>
-          <w:rFonts w:ascii="Century Schoolbook" w:hAnsi="Century Schoolbook"/>
-          <w:b/>
-          <w:bCs/>
-        </w:rPr>
-        <w:t>category_name</w:t>
-      </w:r>
-      <w:proofErr w:type="spellEnd"/>
-      <w:r>
-        <w:rPr>
-          <w:rFonts w:ascii="Century Schoolbook" w:hAnsi="Century Schoolbook"/>
-        </w:rPr>
-        <w:t xml:space="preserve"> label, why would simply dropping these rows (</w:t>
-      </w:r>
-      <w:r>
-        <w:rPr>
-          <w:rFonts w:ascii="Century Schoolbook" w:hAnsi="Century Schoolbook"/>
-        </w:rPr>
-        <w:t xml:space="preserve">with </w:t>
-      </w:r>
-      <w:proofErr w:type="spellStart"/>
-      <w:proofErr w:type="gramStart"/>
-      <w:r>
-        <w:rPr>
-          <w:rFonts w:ascii="Century Schoolbook" w:hAnsi="Century Schoolbook"/>
-          <w:b/>
-          <w:bCs/>
-        </w:rPr>
-        <w:t>dropna</w:t>
-      </w:r>
-      <w:proofErr w:type="spellEnd"/>
-      <w:r>
-        <w:rPr>
-          <w:rFonts w:ascii="Century Schoolbook" w:hAnsi="Century Schoolbook"/>
-          <w:b/>
-          <w:bCs/>
-        </w:rPr>
-        <w:t>(</w:t>
-      </w:r>
-      <w:proofErr w:type="gramEnd"/>
-      <w:r>
-        <w:rPr>
-          <w:rFonts w:ascii="Century Schoolbook" w:hAnsi="Century Schoolbook"/>
-          <w:b/>
-          <w:bCs/>
-        </w:rPr>
-        <w:t>)</w:t>
-      </w:r>
-      <w:r>
-        <w:rPr>
-          <w:rFonts w:ascii="Century Schoolbook" w:hAnsi="Century Schoolbook"/>
-        </w:rPr>
-        <w:t>)</w:t>
-      </w:r>
-      <w:r>
-        <w:rPr>
-          <w:rFonts w:ascii="Century Schoolbook" w:hAnsi="Century Schoolbook"/>
-        </w:rPr>
-        <w:t xml:space="preserve"> be a flawed data mining strategy? Name one objective alternative so the text data can still be utilized.</w:t>
-      </w:r>
-    </w:p>
-    <w:p>
-      <w:pPr>
-        <w:jc w:val="both"/>
-        <w:rPr>
-          <w:rFonts w:ascii="Century Schoolbook" w:hAnsi="Century Schoolbook"/>
-        </w:rPr>
-      </w:pPr>
-      <w:r>
-        <w:rPr>
-          <w:rFonts w:ascii="Century Schoolbook" w:hAnsi="Century Schoolbook"/>
-          <w:b/>
-          <w:bCs/>
-        </w:rPr>
-        <w:t>Answer:</w:t>
+        <w:t>() removes the entire document, not just the missing label, even though the text itself is complete. With 40% of the documents removed, we would lose a large amount of useful data. One alternative is to estimate the missing labels, for example by using the 60% of documents that have labels to predict the category of the unlabeled ones. Another option is to ignore the label and still mine the text itself, since the text does not need a label to be analyzed.</w:t>
       </w:r>
     </w:p>
     <w:p>
@@ -1830,7 +1956,19 @@
         <w:rPr>
           <w:rFonts w:ascii="Century Schoolbook" w:hAnsi="Century Schoolbook"/>
         </w:rPr>
-        <w:t xml:space="preserve"> Yes / No </w:t>
+        <w:t xml:space="preserve"> </w:t>
+      </w:r>
+      <w:r>
+        <w:rPr>
+          <w:rFonts w:ascii="Century Schoolbook" w:hAnsi="Century Schoolbook" w:hint="eastAsia"/>
+        </w:rPr>
+        <w:t>NO</w:t>
+      </w:r>
+      <w:r>
+        <w:rPr>
+          <w:rFonts w:ascii="Century Schoolbook" w:hAnsi="Century Schoolbook"/>
+        </w:rPr>
+        <w:t xml:space="preserve"> </w:t>
       </w:r>
     </w:p>
     <w:p>
@@ -1897,62 +2035,21 @@
       <w:pPr>
         <w:jc w:val="both"/>
         <w:rPr>
-          <w:rFonts w:ascii="Century Schoolbook" w:hAnsi="Century Schoolbook"/>
-        </w:rPr>
-      </w:pPr>
-    </w:p>
-    <w:p>
-      <w:pPr>
-        <w:jc w:val="both"/>
-        <w:rPr>
-          <w:rFonts w:ascii="Century Schoolbook" w:hAnsi="Century Schoolbook"/>
-        </w:rPr>
-      </w:pPr>
-    </w:p>
-    <w:p>
-      <w:pPr>
-        <w:jc w:val="both"/>
-        <w:rPr>
-          <w:rFonts w:ascii="Century Schoolbook" w:hAnsi="Century Schoolbook"/>
-        </w:rPr>
-      </w:pPr>
-    </w:p>
-    <w:p>
-      <w:pPr>
-        <w:jc w:val="both"/>
-        <w:rPr>
-          <w:rFonts w:ascii="Century Schoolbook" w:hAnsi="Century Schoolbook"/>
-        </w:rPr>
-      </w:pPr>
-    </w:p>
-    <w:p>
-      <w:pPr>
-        <w:jc w:val="both"/>
-        <w:rPr>
-          <w:rFonts w:ascii="Century Schoolbook" w:hAnsi="Century Schoolbook"/>
-        </w:rPr>
-      </w:pPr>
-    </w:p>
-    <w:p>
-      <w:pPr>
-        <w:jc w:val="both"/>
-        <w:rPr>
-          <w:rFonts w:ascii="Century Schoolbook" w:hAnsi="Century Schoolbook"/>
-        </w:rPr>
-      </w:pPr>
-    </w:p>
-    <w:p>
-      <w:pPr>
-        <w:jc w:val="both"/>
-        <w:rPr>
-          <w:rFonts w:ascii="Century Schoolbook" w:hAnsi="Century Schoolbook"/>
-        </w:rPr>
-      </w:pPr>
-      <w:r>
-        <w:rPr>
-          <w:rFonts w:ascii="Century Schoolbook" w:hAnsi="Century Schoolbook"/>
-        </w:rPr>
-        <w:lastRenderedPageBreak/>
+          <w:rFonts w:ascii="Century Schoolbook" w:hAnsi="Century Schoolbook" w:hint="eastAsia"/>
+        </w:rPr>
+      </w:pPr>
+    </w:p>
+    <w:p>
+      <w:pPr>
+        <w:jc w:val="both"/>
+        <w:rPr>
+          <w:rFonts w:ascii="Century Schoolbook" w:hAnsi="Century Schoolbook"/>
+        </w:rPr>
+      </w:pPr>
+      <w:r>
+        <w:rPr>
+          <w:rFonts w:ascii="Century Schoolbook" w:hAnsi="Century Schoolbook"/>
+        </w:rPr>
         <w:pict w14:anchorId="4353243F">
           <v:rect id="_x0000_i1029" style="width:0;height:1.5pt" o:hralign="center" o:hrstd="t" o:hr="t" fillcolor="#a0a0a0" stroked="f"/>
         </w:pict>
@@ -2137,6 +2234,40 @@
         </w:rPr>
         <w:t>Answer:</w:t>
       </w:r>
+      <w:r>
+        <w:rPr>
+          <w:rFonts w:ascii="Century Schoolbook" w:hAnsi="Century Schoolbook"/>
+          <w:b/>
+          <w:bCs/>
+        </w:rPr>
+        <w:br/>
+      </w:r>
+      <w:r>
+        <w:rPr>
+          <w:rFonts w:ascii="Century Schoolbook" w:hAnsi="Century Schoolbook" w:hint="eastAsia"/>
+        </w:rPr>
+        <w:t>1.NO</w:t>
+      </w:r>
+    </w:p>
+    <w:p>
+      <w:pPr>
+        <w:jc w:val="both"/>
+        <w:rPr>
+          <w:rFonts w:ascii="Century Schoolbook" w:hAnsi="Century Schoolbook"/>
+        </w:rPr>
+      </w:pPr>
+      <w:r>
+        <w:rPr>
+          <w:rFonts w:ascii="Century Schoolbook" w:hAnsi="Century Schoolbook" w:hint="eastAsia"/>
+        </w:rPr>
+        <w:t>2.</w:t>
+      </w:r>
+      <w:r>
+        <w:rPr>
+          <w:rFonts w:ascii="Century Schoolbook" w:hAnsi="Century Schoolbook"/>
+        </w:rPr>
+        <w:t xml:space="preserve"> highly imbalanced dataset, simple random sampling may select very few from a minority category, so that category may be missing from the sample</w:t>
+      </w:r>
     </w:p>
     <w:p>
       <w:pPr>
@@ -2157,7 +2288,7 @@
         <w:rPr>
           <w:rFonts w:ascii="Century Schoolbook" w:hAnsi="Century Schoolbook"/>
         </w:rPr>
-        <w:t xml:space="preserve"> Yes / No </w:t>
+        <w:t xml:space="preserve"> Yes </w:t>
       </w:r>
     </w:p>
     <w:p>
@@ -2181,6 +2312,12 @@
         </w:rPr>
         <w:t xml:space="preserve"> </w:t>
       </w:r>
+      <w:r>
+        <w:rPr>
+          <w:rFonts w:ascii="Century Schoolbook" w:hAnsi="Century Schoolbook"/>
+        </w:rPr>
+        <w:t>concept explanation and translating my ideas into English</w:t>
+      </w:r>
     </w:p>
     <w:p>
       <w:pPr>
@@ -2202,6 +2339,32 @@
           <w:rFonts w:ascii="Century Schoolbook" w:hAnsi="Century Schoolbook"/>
         </w:rPr>
         <w:t xml:space="preserve"> </w:t>
+      </w:r>
+      <w:r>
+        <w:rPr>
+          <w:rFonts w:ascii="Century Schoolbook" w:hAnsi="Century Schoolbook"/>
+        </w:rPr>
+        <w:br/>
+      </w:r>
+      <w:r>
+        <w:rPr>
+          <w:rFonts w:ascii="Century Schoolbook" w:hAnsi="Century Schoolbook"/>
+        </w:rPr>
+        <w:t>https://pandas.pydata.org/docs/reference/api/pandas.DataFrame.sample.html</w:t>
+      </w:r>
+    </w:p>
+    <w:p>
+      <w:pPr>
+        <w:jc w:val="both"/>
+        <w:rPr>
+          <w:rFonts w:ascii="Century Schoolbook" w:hAnsi="Century Schoolbook"/>
+        </w:rPr>
+      </w:pPr>
+      <w:r>
+        <w:rPr>
+          <w:rFonts w:ascii="Century Schoolbook" w:hAnsi="Century Schoolbook"/>
+        </w:rPr>
+        <w:t>https://en.wikipedia.org/wiki/Stratified_sampling</w:t>
       </w:r>
     </w:p>
     <w:p>
@@ -2479,6 +2642,8 @@
         <w:jc w:val="both"/>
         <w:rPr>
           <w:rFonts w:ascii="Century Schoolbook" w:hAnsi="Century Schoolbook"/>
+          <w:b/>
+          <w:bCs/>
         </w:rPr>
       </w:pPr>
       <w:r>
@@ -2499,6 +2664,98 @@
       </w:pPr>
       <w:r>
         <w:rPr>
+          <w:rFonts w:ascii="Century Schoolbook" w:hAnsi="Century Schoolbook" w:hint="eastAsia"/>
+        </w:rPr>
+        <w:t>1.</w:t>
+      </w:r>
+      <w:r>
+        <w:rPr>
+          <w:rFonts w:ascii="Century Schoolbook" w:hAnsi="Century Schoolbook"/>
+        </w:rPr>
+        <w:t>T</w:t>
+      </w:r>
+      <w:r>
+        <w:rPr>
+          <w:rFonts w:ascii="Century Schoolbook" w:hAnsi="Century Schoolbook" w:hint="eastAsia"/>
+        </w:rPr>
+        <w:t xml:space="preserve">he number </w:t>
+      </w:r>
+      <w:r>
+        <w:rPr>
+          <w:rFonts w:ascii="Century Schoolbook" w:hAnsi="Century Schoolbook"/>
+        </w:rPr>
+        <w:t>of features increases</w:t>
+      </w:r>
+    </w:p>
+    <w:p>
+      <w:pPr>
+        <w:jc w:val="both"/>
+        <w:rPr>
+          <w:rFonts w:ascii="Century Schoolbook" w:hAnsi="Century Schoolbook"/>
+        </w:rPr>
+      </w:pPr>
+      <w:r>
+        <w:rPr>
+          <w:rFonts w:ascii="Century Schoolbook" w:hAnsi="Century Schoolbook" w:hint="eastAsia"/>
+        </w:rPr>
+        <w:t>2.</w:t>
+      </w:r>
+      <w:r>
+        <w:rPr>
+          <w:rFonts w:ascii="Century Schoolbook" w:hAnsi="Century Schoolbook"/>
+        </w:rPr>
+        <w:t xml:space="preserve">The sparsity </w:t>
+      </w:r>
+      <w:proofErr w:type="spellStart"/>
+      <w:r>
+        <w:rPr>
+          <w:rFonts w:ascii="Century Schoolbook" w:hAnsi="Century Schoolbook"/>
+        </w:rPr>
+        <w:t>decreases</w:t>
+      </w:r>
+      <w:r>
+        <w:rPr>
+          <w:rFonts w:ascii="Century Schoolbook" w:hAnsi="Century Schoolbook" w:hint="eastAsia"/>
+        </w:rPr>
+        <w:t>,because</w:t>
+      </w:r>
+      <w:proofErr w:type="spellEnd"/>
+      <w:r>
+        <w:rPr>
+          <w:rFonts w:ascii="Century Schoolbook" w:hAnsi="Century Schoolbook" w:hint="eastAsia"/>
+        </w:rPr>
+        <w:t xml:space="preserve"> </w:t>
+      </w:r>
+      <w:proofErr w:type="spellStart"/>
+      <w:r>
+        <w:rPr>
+          <w:rFonts w:ascii="Century Schoolbook" w:hAnsi="Century Schoolbook" w:hint="eastAsia"/>
+        </w:rPr>
+        <w:t>stopwords</w:t>
+      </w:r>
+      <w:proofErr w:type="spellEnd"/>
+      <w:r>
+        <w:rPr>
+          <w:rFonts w:ascii="Century Schoolbook" w:hAnsi="Century Schoolbook" w:hint="eastAsia"/>
+        </w:rPr>
+        <w:t xml:space="preserve"> appear almost every </w:t>
+      </w:r>
+      <w:r>
+        <w:rPr>
+          <w:rFonts w:ascii="Century Schoolbook" w:hAnsi="Century Schoolbook"/>
+        </w:rPr>
+        <w:t>document</w:t>
+      </w:r>
+    </w:p>
+    <w:p>
+      <w:pPr>
+        <w:jc w:val="both"/>
+        <w:rPr>
+          <w:rFonts w:ascii="Century Schoolbook" w:hAnsi="Century Schoolbook"/>
+        </w:rPr>
+      </w:pPr>
+      <w:r>
+        <w:rPr>
           <w:rFonts w:ascii="Century Schoolbook" w:hAnsi="Century Schoolbook"/>
           <w:b/>
           <w:bCs/>
@@ -2509,22 +2766,23 @@
         <w:rPr>
           <w:rFonts w:ascii="Century Schoolbook" w:hAnsi="Century Schoolbook"/>
         </w:rPr>
-        <w:t xml:space="preserve"> Yes / No </w:t>
-      </w:r>
-    </w:p>
-    <w:p>
-      <w:pPr>
-        <w:jc w:val="both"/>
-        <w:rPr>
-          <w:rFonts w:ascii="Century Schoolbook" w:hAnsi="Century Schoolbook"/>
-        </w:rPr>
-      </w:pPr>
-      <w:r>
-        <w:rPr>
-          <w:rFonts w:ascii="Century Schoolbook" w:hAnsi="Century Schoolbook"/>
-          <w:b/>
-          <w:bCs/>
-        </w:rPr>
+        <w:t xml:space="preserve"> Yes </w:t>
+      </w:r>
+    </w:p>
+    <w:p>
+      <w:pPr>
+        <w:jc w:val="both"/>
+        <w:rPr>
+          <w:rFonts w:ascii="Century Schoolbook" w:hAnsi="Century Schoolbook"/>
+        </w:rPr>
+      </w:pPr>
+      <w:r>
+        <w:rPr>
+          <w:rFonts w:ascii="Century Schoolbook" w:hAnsi="Century Schoolbook"/>
+          <w:b/>
+          <w:bCs/>
+        </w:rPr>
+        <w:lastRenderedPageBreak/>
         <w:t>If yes, how:</w:t>
       </w:r>
       <w:r>
@@ -2533,6 +2791,12 @@
         </w:rPr>
         <w:t xml:space="preserve"> </w:t>
       </w:r>
+      <w:r>
+        <w:rPr>
+          <w:rFonts w:ascii="Century Schoolbook" w:hAnsi="Century Schoolbook"/>
+        </w:rPr>
+        <w:t>concept explanation, a helper code snippet to compute sparsity, and translating my ideas into English</w:t>
+      </w:r>
     </w:p>
     <w:p>
       <w:pPr>
@@ -2555,67 +2819,72 @@
         </w:rPr>
         <w:t xml:space="preserve"> </w:t>
       </w:r>
-    </w:p>
-    <w:p>
-      <w:pPr>
-        <w:jc w:val="both"/>
-        <w:rPr>
-          <w:rFonts w:ascii="Century Schoolbook" w:hAnsi="Century Schoolbook"/>
-        </w:rPr>
-      </w:pPr>
-    </w:p>
-    <w:p>
-      <w:pPr>
-        <w:jc w:val="both"/>
-        <w:rPr>
-          <w:rFonts w:ascii="Century Schoolbook" w:hAnsi="Century Schoolbook"/>
-        </w:rPr>
-      </w:pPr>
-    </w:p>
-    <w:p>
-      <w:pPr>
-        <w:jc w:val="both"/>
-        <w:rPr>
-          <w:rFonts w:ascii="Century Schoolbook" w:hAnsi="Century Schoolbook"/>
-        </w:rPr>
-      </w:pPr>
-    </w:p>
-    <w:p>
-      <w:pPr>
-        <w:jc w:val="both"/>
-        <w:rPr>
-          <w:rFonts w:ascii="Century Schoolbook" w:hAnsi="Century Schoolbook"/>
-        </w:rPr>
-      </w:pPr>
-    </w:p>
-    <w:p>
-      <w:pPr>
-        <w:jc w:val="both"/>
-        <w:rPr>
-          <w:rFonts w:ascii="Century Schoolbook" w:hAnsi="Century Schoolbook"/>
-        </w:rPr>
-      </w:pPr>
-    </w:p>
-    <w:p>
-      <w:pPr>
-        <w:jc w:val="both"/>
-        <w:rPr>
-          <w:rFonts w:ascii="Century Schoolbook" w:hAnsi="Century Schoolbook"/>
-        </w:rPr>
-      </w:pPr>
-    </w:p>
-    <w:p>
-      <w:pPr>
-        <w:jc w:val="both"/>
-        <w:rPr>
-          <w:rFonts w:ascii="Century Schoolbook" w:hAnsi="Century Schoolbook"/>
-        </w:rPr>
-      </w:pPr>
-      <w:r>
-        <w:rPr>
-          <w:rFonts w:ascii="Century Schoolbook" w:hAnsi="Century Schoolbook"/>
-        </w:rPr>
-        <w:lastRenderedPageBreak/>
+      <w:r>
+        <w:rPr>
+          <w:rFonts w:ascii="Century Schoolbook" w:hAnsi="Century Schoolbook"/>
+        </w:rPr>
+        <w:t>https://scikit-learn.org/stable/modules/feature_extraction.html</w:t>
+      </w:r>
+    </w:p>
+    <w:p>
+      <w:pPr>
+        <w:jc w:val="both"/>
+        <w:rPr>
+          <w:rFonts w:ascii="Century Schoolbook" w:hAnsi="Century Schoolbook"/>
+        </w:rPr>
+      </w:pPr>
+    </w:p>
+    <w:p>
+      <w:pPr>
+        <w:jc w:val="both"/>
+        <w:rPr>
+          <w:rFonts w:ascii="Century Schoolbook" w:hAnsi="Century Schoolbook"/>
+        </w:rPr>
+      </w:pPr>
+    </w:p>
+    <w:p>
+      <w:pPr>
+        <w:jc w:val="both"/>
+        <w:rPr>
+          <w:rFonts w:ascii="Century Schoolbook" w:hAnsi="Century Schoolbook"/>
+        </w:rPr>
+      </w:pPr>
+    </w:p>
+    <w:p>
+      <w:pPr>
+        <w:jc w:val="both"/>
+        <w:rPr>
+          <w:rFonts w:ascii="Century Schoolbook" w:hAnsi="Century Schoolbook"/>
+        </w:rPr>
+      </w:pPr>
+    </w:p>
+    <w:p>
+      <w:pPr>
+        <w:jc w:val="both"/>
+        <w:rPr>
+          <w:rFonts w:ascii="Century Schoolbook" w:hAnsi="Century Schoolbook"/>
+        </w:rPr>
+      </w:pPr>
+    </w:p>
+    <w:p>
+      <w:pPr>
+        <w:jc w:val="both"/>
+        <w:rPr>
+          <w:rFonts w:ascii="Century Schoolbook" w:hAnsi="Century Schoolbook"/>
+        </w:rPr>
+      </w:pPr>
+    </w:p>
+    <w:p>
+      <w:pPr>
+        <w:jc w:val="both"/>
+        <w:rPr>
+          <w:rFonts w:ascii="Century Schoolbook" w:hAnsi="Century Schoolbook"/>
+        </w:rPr>
+      </w:pPr>
+      <w:r>
+        <w:rPr>
+          <w:rFonts w:ascii="Century Schoolbook" w:hAnsi="Century Schoolbook"/>
+        </w:rPr>
         <w:pict w14:anchorId="5994C8B3">
           <v:rect id="_x0000_i1031" style="width:0;height:1.5pt" o:hralign="center" o:hrstd="t" o:hr="t" fillcolor="#a0a0a0" stroked="f"/>
         </w:pict>
@@ -2835,6 +3104,8 @@
         <w:jc w:val="both"/>
         <w:rPr>
           <w:rFonts w:ascii="Century Schoolbook" w:hAnsi="Century Schoolbook"/>
+          <w:b/>
+          <w:bCs/>
         </w:rPr>
       </w:pPr>
       <w:r>
@@ -2844,6 +3115,69 @@
           <w:bCs/>
         </w:rPr>
         <w:t>Answer:</w:t>
+      </w:r>
+    </w:p>
+    <w:p>
+      <w:pPr>
+        <w:pStyle w:val="a9"/>
+        <w:numPr>
+          <w:ilvl w:val="1"/>
+          <w:numId w:val="19"/>
+        </w:numPr>
+        <w:jc w:val="both"/>
+        <w:rPr>
+          <w:rFonts w:ascii="Century Schoolbook" w:hAnsi="Century Schoolbook"/>
+        </w:rPr>
+      </w:pPr>
+      <w:r>
+        <w:rPr>
+          <w:rFonts w:ascii="Century Schoolbook" w:hAnsi="Century Schoolbook"/>
+        </w:rPr>
+        <w:t>decreases</w:t>
+      </w:r>
+    </w:p>
+    <w:p>
+      <w:pPr>
+        <w:pStyle w:val="a9"/>
+        <w:numPr>
+          <w:ilvl w:val="1"/>
+          <w:numId w:val="19"/>
+        </w:numPr>
+        <w:jc w:val="both"/>
+        <w:rPr>
+          <w:rFonts w:ascii="Century Schoolbook" w:hAnsi="Century Schoolbook"/>
+        </w:rPr>
+      </w:pPr>
+      <w:r>
+        <w:rPr>
+          <w:rFonts w:ascii="Century Schoolbook" w:hAnsi="Century Schoolbook" w:hint="eastAsia"/>
+        </w:rPr>
+        <w:t>r</w:t>
+      </w:r>
+      <w:r>
+        <w:rPr>
+          <w:rFonts w:ascii="Century Schoolbook" w:hAnsi="Century Schoolbook"/>
+        </w:rPr>
+        <w:t>are words</w:t>
+      </w:r>
+    </w:p>
+    <w:p>
+      <w:pPr>
+        <w:pStyle w:val="a9"/>
+        <w:numPr>
+          <w:ilvl w:val="1"/>
+          <w:numId w:val="19"/>
+        </w:numPr>
+        <w:jc w:val="both"/>
+        <w:rPr>
+          <w:rFonts w:ascii="Century Schoolbook" w:hAnsi="Century Schoolbook" w:hint="eastAsia"/>
+        </w:rPr>
+      </w:pPr>
+      <w:r>
+        <w:rPr>
+          <w:rFonts w:ascii="Century Schoolbook" w:hAnsi="Century Schoolbook"/>
+        </w:rPr>
+        <w:t>can't help distinguish one document from another</w:t>
       </w:r>
     </w:p>
     <w:tbl>
@@ -2956,6 +3290,12 @@
                 <w:rFonts w:ascii="Century Schoolbook" w:hAnsi="Century Schoolbook"/>
               </w:rPr>
             </w:pPr>
+            <w:r>
+              <w:rPr>
+                <w:rFonts w:ascii="Century Schoolbook" w:hAnsi="Century Schoolbook" w:hint="eastAsia"/>
+              </w:rPr>
+              <w:t>35482</w:t>
+            </w:r>
           </w:p>
         </w:tc>
       </w:tr>
@@ -2997,6 +3337,12 @@
                 <w:rFonts w:ascii="Century Schoolbook" w:hAnsi="Century Schoolbook"/>
               </w:rPr>
             </w:pPr>
+            <w:r>
+              <w:rPr>
+                <w:rFonts w:ascii="Century Schoolbook" w:hAnsi="Century Schoolbook" w:hint="eastAsia"/>
+              </w:rPr>
+              <w:t>5089</w:t>
+            </w:r>
           </w:p>
         </w:tc>
       </w:tr>
@@ -3038,6 +3384,12 @@
                 <w:rFonts w:ascii="Century Schoolbook" w:hAnsi="Century Schoolbook"/>
               </w:rPr>
             </w:pPr>
+            <w:r>
+              <w:rPr>
+                <w:rFonts w:ascii="Century Schoolbook" w:hAnsi="Century Schoolbook" w:hint="eastAsia"/>
+              </w:rPr>
+              <w:t>1491</w:t>
+            </w:r>
           </w:p>
         </w:tc>
       </w:tr>
@@ -3061,7 +3413,7 @@
         <w:rPr>
           <w:rFonts w:ascii="Century Schoolbook" w:hAnsi="Century Schoolbook"/>
         </w:rPr>
-        <w:t xml:space="preserve"> Yes / No </w:t>
+        <w:t xml:space="preserve"> Yes </w:t>
       </w:r>
     </w:p>
     <w:p>
@@ -3085,145 +3437,166 @@
         </w:rPr>
         <w:t xml:space="preserve"> </w:t>
       </w:r>
-    </w:p>
-    <w:p>
-      <w:pPr>
-        <w:jc w:val="both"/>
-        <w:rPr>
-          <w:rFonts w:ascii="Century Schoolbook" w:hAnsi="Century Schoolbook"/>
-        </w:rPr>
-      </w:pPr>
-      <w:r>
-        <w:rPr>
-          <w:rFonts w:ascii="Century Schoolbook" w:hAnsi="Century Schoolbook"/>
-          <w:b/>
-          <w:bCs/>
-        </w:rPr>
-        <w:t>External references (links):</w:t>
-      </w:r>
-      <w:r>
-        <w:rPr>
-          <w:rFonts w:ascii="Century Schoolbook" w:hAnsi="Century Schoolbook"/>
+      <w:r>
+        <w:rPr>
+          <w:rFonts w:ascii="Century Schoolbook" w:hAnsi="Century Schoolbook"/>
+        </w:rPr>
+        <w:t>concept explanation and translating my ideas into English</w:t>
+      </w:r>
+    </w:p>
+    <w:p>
+      <w:pPr>
+        <w:jc w:val="both"/>
+        <w:rPr>
+          <w:rFonts w:ascii="Century Schoolbook" w:hAnsi="Century Schoolbook"/>
+        </w:rPr>
+      </w:pPr>
+      <w:r>
+        <w:rPr>
+          <w:rFonts w:ascii="Century Schoolbook" w:hAnsi="Century Schoolbook"/>
+          <w:b/>
+          <w:bCs/>
+        </w:rPr>
+        <w:t>External</w:t>
+      </w:r>
+      <w:r>
+        <w:rPr>
+          <w:rFonts w:ascii="Century Schoolbook" w:hAnsi="Century Schoolbook" w:hint="eastAsia"/>
+          <w:b/>
+          <w:bCs/>
         </w:rPr>
         <w:t xml:space="preserve"> </w:t>
       </w:r>
-    </w:p>
-    <w:p>
-      <w:pPr>
-        <w:jc w:val="both"/>
-        <w:rPr>
-          <w:rFonts w:ascii="Century Schoolbook" w:hAnsi="Century Schoolbook"/>
-        </w:rPr>
-      </w:pPr>
-    </w:p>
-    <w:p>
-      <w:pPr>
-        <w:jc w:val="both"/>
-        <w:rPr>
-          <w:rFonts w:ascii="Century Schoolbook" w:hAnsi="Century Schoolbook"/>
-        </w:rPr>
-      </w:pPr>
-    </w:p>
-    <w:p>
-      <w:pPr>
-        <w:jc w:val="both"/>
-        <w:rPr>
-          <w:rFonts w:ascii="Century Schoolbook" w:hAnsi="Century Schoolbook"/>
-        </w:rPr>
-      </w:pPr>
-    </w:p>
-    <w:p>
-      <w:pPr>
-        <w:jc w:val="both"/>
-        <w:rPr>
-          <w:rFonts w:ascii="Century Schoolbook" w:hAnsi="Century Schoolbook"/>
-        </w:rPr>
-      </w:pPr>
-    </w:p>
-    <w:p>
-      <w:pPr>
-        <w:jc w:val="both"/>
-        <w:rPr>
-          <w:rFonts w:ascii="Century Schoolbook" w:hAnsi="Century Schoolbook"/>
-        </w:rPr>
-      </w:pPr>
-    </w:p>
-    <w:p>
-      <w:pPr>
-        <w:jc w:val="both"/>
-        <w:rPr>
-          <w:rFonts w:ascii="Century Schoolbook" w:hAnsi="Century Schoolbook"/>
-        </w:rPr>
-      </w:pPr>
-    </w:p>
-    <w:p>
-      <w:pPr>
-        <w:jc w:val="both"/>
-        <w:rPr>
-          <w:rFonts w:ascii="Century Schoolbook" w:hAnsi="Century Schoolbook"/>
-        </w:rPr>
-      </w:pPr>
-    </w:p>
-    <w:p>
-      <w:pPr>
-        <w:jc w:val="both"/>
-        <w:rPr>
-          <w:rFonts w:ascii="Century Schoolbook" w:hAnsi="Century Schoolbook"/>
-        </w:rPr>
-      </w:pPr>
-    </w:p>
-    <w:p>
-      <w:pPr>
-        <w:jc w:val="both"/>
-        <w:rPr>
-          <w:rFonts w:ascii="Century Schoolbook" w:hAnsi="Century Schoolbook"/>
-        </w:rPr>
-      </w:pPr>
-    </w:p>
-    <w:p>
-      <w:pPr>
-        <w:jc w:val="both"/>
-        <w:rPr>
-          <w:rFonts w:ascii="Century Schoolbook" w:hAnsi="Century Schoolbook"/>
-        </w:rPr>
-      </w:pPr>
-    </w:p>
-    <w:p>
-      <w:pPr>
-        <w:jc w:val="both"/>
-        <w:rPr>
-          <w:rFonts w:ascii="Century Schoolbook" w:hAnsi="Century Schoolbook"/>
-        </w:rPr>
-      </w:pPr>
-    </w:p>
-    <w:p>
-      <w:pPr>
-        <w:jc w:val="both"/>
-        <w:rPr>
-          <w:rFonts w:ascii="Century Schoolbook" w:hAnsi="Century Schoolbook"/>
-        </w:rPr>
-      </w:pPr>
-    </w:p>
-    <w:p>
-      <w:pPr>
-        <w:jc w:val="both"/>
-        <w:rPr>
-          <w:rFonts w:ascii="Century Schoolbook" w:hAnsi="Century Schoolbook"/>
-        </w:rPr>
-      </w:pPr>
-    </w:p>
-    <w:p>
-      <w:pPr>
-        <w:jc w:val="both"/>
-        <w:rPr>
-          <w:rFonts w:ascii="Century Schoolbook" w:hAnsi="Century Schoolbook"/>
-        </w:rPr>
-      </w:pPr>
-      <w:r>
-        <w:rPr>
-          <w:rFonts w:ascii="Century Schoolbook" w:hAnsi="Century Schoolbook"/>
-        </w:rPr>
-        <w:lastRenderedPageBreak/>
+      <w:r>
+        <w:rPr>
+          <w:rFonts w:ascii="Century Schoolbook" w:hAnsi="Century Schoolbook"/>
+          <w:b/>
+          <w:bCs/>
+        </w:rPr>
+        <w:t>references(links):</w:t>
+      </w:r>
+      <w:r>
+        <w:rPr>
+          <w:rFonts w:ascii="Century Schoolbook" w:hAnsi="Century Schoolbook"/>
+        </w:rPr>
+        <w:t>https://scikit-learn.org/stable/modules/feature_selection.html#removing-features-with-low-variance</w:t>
+      </w:r>
+    </w:p>
+    <w:p>
+      <w:pPr>
+        <w:jc w:val="both"/>
+        <w:rPr>
+          <w:rFonts w:ascii="Century Schoolbook" w:hAnsi="Century Schoolbook"/>
+        </w:rPr>
+      </w:pPr>
+    </w:p>
+    <w:p>
+      <w:pPr>
+        <w:jc w:val="both"/>
+        <w:rPr>
+          <w:rFonts w:ascii="Century Schoolbook" w:hAnsi="Century Schoolbook"/>
+        </w:rPr>
+      </w:pPr>
+    </w:p>
+    <w:p>
+      <w:pPr>
+        <w:jc w:val="both"/>
+        <w:rPr>
+          <w:rFonts w:ascii="Century Schoolbook" w:hAnsi="Century Schoolbook"/>
+        </w:rPr>
+      </w:pPr>
+    </w:p>
+    <w:p>
+      <w:pPr>
+        <w:jc w:val="both"/>
+        <w:rPr>
+          <w:rFonts w:ascii="Century Schoolbook" w:hAnsi="Century Schoolbook"/>
+        </w:rPr>
+      </w:pPr>
+    </w:p>
+    <w:p>
+      <w:pPr>
+        <w:jc w:val="both"/>
+        <w:rPr>
+          <w:rFonts w:ascii="Century Schoolbook" w:hAnsi="Century Schoolbook"/>
+        </w:rPr>
+      </w:pPr>
+    </w:p>
+    <w:p>
+      <w:pPr>
+        <w:jc w:val="both"/>
+        <w:rPr>
+          <w:rFonts w:ascii="Century Schoolbook" w:hAnsi="Century Schoolbook"/>
+        </w:rPr>
+      </w:pPr>
+    </w:p>
+    <w:p>
+      <w:pPr>
+        <w:jc w:val="both"/>
+        <w:rPr>
+          <w:rFonts w:ascii="Century Schoolbook" w:hAnsi="Century Schoolbook"/>
+        </w:rPr>
+      </w:pPr>
+    </w:p>
+    <w:p>
+      <w:pPr>
+        <w:jc w:val="both"/>
+        <w:rPr>
+          <w:rFonts w:ascii="Century Schoolbook" w:hAnsi="Century Schoolbook"/>
+        </w:rPr>
+      </w:pPr>
+    </w:p>
+    <w:p>
+      <w:pPr>
+        <w:jc w:val="both"/>
+        <w:rPr>
+          <w:rFonts w:ascii="Century Schoolbook" w:hAnsi="Century Schoolbook"/>
+        </w:rPr>
+      </w:pPr>
+    </w:p>
+    <w:p>
+      <w:pPr>
+        <w:jc w:val="both"/>
+        <w:rPr>
+          <w:rFonts w:ascii="Century Schoolbook" w:hAnsi="Century Schoolbook"/>
+        </w:rPr>
+      </w:pPr>
+    </w:p>
+    <w:p>
+      <w:pPr>
+        <w:jc w:val="both"/>
+        <w:rPr>
+          <w:rFonts w:ascii="Century Schoolbook" w:hAnsi="Century Schoolbook"/>
+        </w:rPr>
+      </w:pPr>
+    </w:p>
+    <w:p>
+      <w:pPr>
+        <w:jc w:val="both"/>
+        <w:rPr>
+          <w:rFonts w:ascii="Century Schoolbook" w:hAnsi="Century Schoolbook"/>
+        </w:rPr>
+      </w:pPr>
+    </w:p>
+    <w:p>
+      <w:pPr>
+        <w:jc w:val="both"/>
+        <w:rPr>
+          <w:rFonts w:ascii="Century Schoolbook" w:hAnsi="Century Schoolbook"/>
+        </w:rPr>
+      </w:pPr>
+    </w:p>
+    <w:p>
+      <w:pPr>
+        <w:jc w:val="both"/>
+        <w:rPr>
+          <w:rFonts w:ascii="Century Schoolbook" w:hAnsi="Century Schoolbook"/>
+        </w:rPr>
+      </w:pPr>
+      <w:r>
+        <w:rPr>
+          <w:rFonts w:ascii="Century Schoolbook" w:hAnsi="Century Schoolbook"/>
+        </w:rPr>
         <w:pict w14:anchorId="3BE467AD">
           <v:rect id="_x0000_i1032" style="width:0;height:1.5pt" o:hralign="center" o:hrstd="t" o:hr="t" fillcolor="#a0a0a0" stroked="f"/>
         </w:pict>
@@ -3305,7 +3678,6 @@
         <w:t xml:space="preserve">Run the correlation filter against the binary indicator for the </w:t>
       </w:r>
       <w:proofErr w:type="spellStart"/>
-      <w:proofErr w:type="gramStart"/>
       <w:r>
         <w:rPr>
           <w:rFonts w:ascii="Century Schoolbook" w:hAnsi="Century Schoolbook"/>
@@ -3315,7 +3687,6 @@
         <w:t>comp.graphics</w:t>
       </w:r>
       <w:proofErr w:type="spellEnd"/>
-      <w:proofErr w:type="gramEnd"/>
       <w:r>
         <w:rPr>
           <w:rFonts w:ascii="Century Schoolbook" w:hAnsi="Century Schoolbook"/>
@@ -3373,7 +3744,7 @@
     </w:p>
     <w:p>
       <w:pPr>
-        <w:pStyle w:val="ListParagraph"/>
+        <w:pStyle w:val="a9"/>
         <w:numPr>
           <w:ilvl w:val="1"/>
           <w:numId w:val="7"/>
@@ -3392,7 +3763,7 @@
     </w:p>
     <w:p>
       <w:pPr>
-        <w:pStyle w:val="ListParagraph"/>
+        <w:pStyle w:val="a9"/>
         <w:numPr>
           <w:ilvl w:val="1"/>
           <w:numId w:val="7"/>
@@ -3439,7 +3810,7 @@
     </w:p>
     <w:p>
       <w:pPr>
-        <w:pStyle w:val="ListParagraph"/>
+        <w:pStyle w:val="a9"/>
         <w:numPr>
           <w:ilvl w:val="1"/>
           <w:numId w:val="7"/>
@@ -3489,6 +3860,8 @@
         <w:jc w:val="both"/>
         <w:rPr>
           <w:rFonts w:ascii="Century Schoolbook" w:hAnsi="Century Schoolbook"/>
+          <w:b/>
+          <w:bCs/>
         </w:rPr>
       </w:pPr>
       <w:r>
@@ -3505,6 +3878,61 @@
         <w:jc w:val="both"/>
         <w:rPr>
           <w:rFonts w:ascii="Century Schoolbook" w:hAnsi="Century Schoolbook"/>
+          <w:b/>
+          <w:bCs/>
+        </w:rPr>
+      </w:pPr>
+      <w:r>
+        <w:rPr>
+          <w:rFonts w:ascii="Century Schoolbook" w:hAnsi="Century Schoolbook" w:hint="eastAsia"/>
+          <w:b/>
+          <w:bCs/>
+        </w:rPr>
+        <w:t>1.both have</w:t>
+      </w:r>
+    </w:p>
+    <w:p>
+      <w:pPr>
+        <w:rPr>
+          <w:rFonts w:ascii="Century Schoolbook" w:hAnsi="Century Schoolbook"/>
+        </w:rPr>
+      </w:pPr>
+      <w:r>
+        <w:rPr>
+          <w:rFonts w:ascii="Century Schoolbook" w:hAnsi="Century Schoolbook"/>
+        </w:rPr>
+        <w:t>2.</w:t>
+      </w:r>
+      <w:r>
+        <w:rPr>
+          <w:rFonts w:ascii="Century Schoolbook" w:hAnsi="Century Schoolbook" w:hint="eastAsia"/>
+        </w:rPr>
+        <w:t>p</w:t>
+      </w:r>
+      <w:r>
+        <w:rPr>
+          <w:rFonts w:ascii="Century Schoolbook" w:hAnsi="Century Schoolbook"/>
+        </w:rPr>
+        <w:t xml:space="preserve">earson correlation uses the actual values </w:t>
+      </w:r>
+      <w:r>
+        <w:rPr>
+          <w:rFonts w:ascii="Century Schoolbook" w:hAnsi="Century Schoolbook" w:hint="eastAsia"/>
+        </w:rPr>
+        <w:t xml:space="preserve">   .</w:t>
+      </w:r>
+      <w:r>
+        <w:rPr>
+          <w:rFonts w:ascii="Century Schoolbook" w:hAnsi="Century Schoolbook"/>
+        </w:rPr>
+        <w:t>Spearman correlation uses the ranks</w:t>
+      </w:r>
+    </w:p>
+    <w:p>
+      <w:pPr>
+        <w:jc w:val="both"/>
+        <w:rPr>
+          <w:rFonts w:ascii="Century Schoolbook" w:hAnsi="Century Schoolbook"/>
         </w:rPr>
       </w:pPr>
       <w:r>
@@ -3519,7 +3947,7 @@
         <w:rPr>
           <w:rFonts w:ascii="Century Schoolbook" w:hAnsi="Century Schoolbook"/>
         </w:rPr>
-        <w:t xml:space="preserve"> Yes / No </w:t>
+        <w:t xml:space="preserve"> Yes </w:t>
       </w:r>
     </w:p>
     <w:p>
@@ -3543,6 +3971,12 @@
         </w:rPr>
         <w:t xml:space="preserve"> </w:t>
       </w:r>
+      <w:r>
+        <w:rPr>
+          <w:rFonts w:ascii="Century Schoolbook" w:hAnsi="Century Schoolbook"/>
+        </w:rPr>
+        <w:t>concept explanation and translating my ideas into English</w:t>
+      </w:r>
     </w:p>
     <w:p>
       <w:pPr>
@@ -3564,6 +3998,12 @@
           <w:rFonts w:ascii="Century Schoolbook" w:hAnsi="Century Schoolbook"/>
         </w:rPr>
         <w:t xml:space="preserve"> </w:t>
+      </w:r>
+      <w:r>
+        <w:rPr>
+          <w:rFonts w:ascii="Century Schoolbook" w:hAnsi="Century Schoolbook"/>
+        </w:rPr>
+        <w:t>https://en.wikipedia.org/wiki/Spearman%27s_rank_correlation_coefficient</w:t>
       </w:r>
     </w:p>
     <w:p>
@@ -3597,6 +4037,7 @@
           <w:b/>
           <w:bCs/>
         </w:rPr>
+        <w:lastRenderedPageBreak/>
         <w:t xml:space="preserve">Question 7: </w:t>
       </w:r>
       <w:r>
@@ -3657,23 +4098,13 @@
         </w:rPr>
         <w:t xml:space="preserve">In the Frequent Pattern Mining section, run </w:t>
       </w:r>
-      <w:proofErr w:type="gramStart"/>
-      <w:r>
-        <w:rPr>
-          <w:rFonts w:ascii="Century Schoolbook" w:hAnsi="Century Schoolbook"/>
-          <w:b/>
-          <w:bCs/>
-        </w:rPr>
-        <w:t>Top-K</w:t>
-      </w:r>
-      <w:proofErr w:type="gramEnd"/>
-      <w:r>
-        <w:rPr>
-          <w:rFonts w:ascii="Century Schoolbook" w:hAnsi="Century Schoolbook"/>
-          <w:b/>
-          <w:bCs/>
-        </w:rPr>
-        <w:t xml:space="preserve"> FAE</w:t>
+      <w:r>
+        <w:rPr>
+          <w:rFonts w:ascii="Century Schoolbook" w:hAnsi="Century Schoolbook"/>
+          <w:b/>
+          <w:bCs/>
+        </w:rPr>
+        <w:t>Top-K FAE</w:t>
       </w:r>
       <w:r>
         <w:rPr>
@@ -3841,23 +4272,13 @@
         </w:rPr>
         <w:t xml:space="preserve">How does the parameter k in </w:t>
       </w:r>
-      <w:proofErr w:type="gramStart"/>
-      <w:r>
-        <w:rPr>
-          <w:rFonts w:ascii="Century Schoolbook" w:hAnsi="Century Schoolbook"/>
-          <w:b/>
-          <w:bCs/>
-        </w:rPr>
-        <w:t>Top-K</w:t>
-      </w:r>
-      <w:proofErr w:type="gramEnd"/>
-      <w:r>
-        <w:rPr>
-          <w:rFonts w:ascii="Century Schoolbook" w:hAnsi="Century Schoolbook"/>
-          <w:b/>
-          <w:bCs/>
-        </w:rPr>
-        <w:t xml:space="preserve"> FAE</w:t>
+      <w:r>
+        <w:rPr>
+          <w:rFonts w:ascii="Century Schoolbook" w:hAnsi="Century Schoolbook"/>
+          <w:b/>
+          <w:bCs/>
+        </w:rPr>
+        <w:t>Top-K FAE</w:t>
       </w:r>
       <w:r>
         <w:rPr>
@@ -3921,34 +4342,16 @@
       <w:pPr>
         <w:jc w:val="both"/>
         <w:rPr>
-          <w:rFonts w:ascii="Century Schoolbook" w:hAnsi="Century Schoolbook"/>
-        </w:rPr>
-      </w:pPr>
-      <w:r>
-        <w:rPr>
-          <w:rFonts w:ascii="Century Schoolbook" w:hAnsi="Century Schoolbook"/>
-          <w:b/>
-          <w:bCs/>
-        </w:rPr>
-        <w:t>Answer (</w:t>
-      </w:r>
-      <w:proofErr w:type="gramStart"/>
-      <w:r>
-        <w:rPr>
-          <w:rFonts w:ascii="Century Schoolbook" w:hAnsi="Century Schoolbook"/>
-          <w:b/>
-          <w:bCs/>
-        </w:rPr>
-        <w:t>1) —</w:t>
-      </w:r>
-      <w:proofErr w:type="gramEnd"/>
-      <w:r>
-        <w:rPr>
-          <w:rFonts w:ascii="Century Schoolbook" w:hAnsi="Century Schoolbook"/>
-          <w:b/>
-          <w:bCs/>
-        </w:rPr>
-        <w:t xml:space="preserve"> Runtime and pattern count when lowering </w:t>
+          <w:rFonts w:ascii="Century Schoolbook" w:hAnsi="Century Schoolbook" w:hint="eastAsia"/>
+        </w:rPr>
+      </w:pPr>
+      <w:r>
+        <w:rPr>
+          <w:rFonts w:ascii="Century Schoolbook" w:hAnsi="Century Schoolbook"/>
+          <w:b/>
+          <w:bCs/>
+        </w:rPr>
+        <w:t xml:space="preserve">Answer (1) — Runtime and pattern count when lowering </w:t>
       </w:r>
       <w:proofErr w:type="spellStart"/>
       <w:r>
@@ -3957,6 +4360,72 @@
           <w:b/>
           <w:bCs/>
         </w:rPr>
+        <w:t>minSup:</w:t>
+      </w:r>
+      <w:r>
+        <w:rPr>
+          <w:rFonts w:hint="eastAsia"/>
+        </w:rPr>
+        <w:t>b</w:t>
+      </w:r>
+      <w:r>
+        <w:rPr>
+          <w:rFonts w:ascii="Century Schoolbook" w:hAnsi="Century Schoolbook"/>
+          <w:b/>
+          <w:bCs/>
+        </w:rPr>
+        <w:t>oth</w:t>
+      </w:r>
+      <w:proofErr w:type="spellEnd"/>
+      <w:r>
+        <w:rPr>
+          <w:rFonts w:ascii="Century Schoolbook" w:hAnsi="Century Schoolbook"/>
+          <w:b/>
+          <w:bCs/>
+        </w:rPr>
+        <w:t xml:space="preserve"> the runtime and the number of patterns increase</w:t>
+      </w:r>
+    </w:p>
+    <w:p>
+      <w:pPr>
+        <w:jc w:val="both"/>
+        <w:rPr>
+          <w:rFonts w:ascii="Century Schoolbook" w:hAnsi="Century Schoolbook"/>
+        </w:rPr>
+      </w:pPr>
+      <w:r>
+        <w:rPr>
+          <w:rFonts w:ascii="Century Schoolbook" w:hAnsi="Century Schoolbook"/>
+          <w:b/>
+          <w:bCs/>
+        </w:rPr>
+        <w:t xml:space="preserve">Answer (2) — Top-K k vs </w:t>
+      </w:r>
+      <w:proofErr w:type="spellStart"/>
+      <w:r>
+        <w:rPr>
+          <w:rFonts w:ascii="Century Schoolbook" w:hAnsi="Century Schoolbook"/>
+          <w:b/>
+          <w:bCs/>
+        </w:rPr>
+        <w:t>MaxFPGrowth</w:t>
+      </w:r>
+      <w:proofErr w:type="spellEnd"/>
+      <w:r>
+        <w:rPr>
+          <w:rFonts w:ascii="Century Schoolbook" w:hAnsi="Century Schoolbook"/>
+          <w:b/>
+          <w:bCs/>
+        </w:rPr>
+        <w:t xml:space="preserve"> </w:t>
+      </w:r>
+      <w:proofErr w:type="spellStart"/>
+      <w:r>
+        <w:rPr>
+          <w:rFonts w:ascii="Century Schoolbook" w:hAnsi="Century Schoolbook"/>
+          <w:b/>
+          <w:bCs/>
+        </w:rPr>
         <w:t>minSup</w:t>
       </w:r>
       <w:proofErr w:type="spellEnd"/>
@@ -3968,109 +4437,56 @@
         </w:rPr>
         <w:t>:</w:t>
       </w:r>
-    </w:p>
-    <w:p>
-      <w:pPr>
-        <w:jc w:val="both"/>
-        <w:rPr>
-          <w:rFonts w:ascii="Century Schoolbook" w:hAnsi="Century Schoolbook"/>
-        </w:rPr>
-      </w:pPr>
-      <w:r>
-        <w:rPr>
-          <w:rFonts w:ascii="Century Schoolbook" w:hAnsi="Century Schoolbook"/>
-          <w:b/>
-          <w:bCs/>
-        </w:rPr>
-        <w:t>Answer (</w:t>
-      </w:r>
-      <w:proofErr w:type="gramStart"/>
-      <w:r>
-        <w:rPr>
-          <w:rFonts w:ascii="Century Schoolbook" w:hAnsi="Century Schoolbook"/>
-          <w:b/>
-          <w:bCs/>
-        </w:rPr>
-        <w:t>2) —</w:t>
-      </w:r>
-      <w:proofErr w:type="gramEnd"/>
-      <w:r>
-        <w:rPr>
-          <w:rFonts w:ascii="Century Schoolbook" w:hAnsi="Century Schoolbook"/>
-          <w:b/>
-          <w:bCs/>
-        </w:rPr>
-        <w:t xml:space="preserve"> Top-K k vs </w:t>
-      </w:r>
-      <w:proofErr w:type="spellStart"/>
-      <w:r>
-        <w:rPr>
-          <w:rFonts w:ascii="Century Schoolbook" w:hAnsi="Century Schoolbook"/>
-          <w:b/>
-          <w:bCs/>
-        </w:rPr>
-        <w:t>MaxFPGrowth</w:t>
-      </w:r>
-      <w:proofErr w:type="spellEnd"/>
-      <w:r>
-        <w:rPr>
-          <w:rFonts w:ascii="Century Schoolbook" w:hAnsi="Century Schoolbook"/>
-          <w:b/>
-          <w:bCs/>
-        </w:rPr>
+      <w:r>
         <w:t xml:space="preserve"> </w:t>
       </w:r>
-      <w:proofErr w:type="spellStart"/>
-      <w:r>
-        <w:rPr>
-          <w:rFonts w:ascii="Century Schoolbook" w:hAnsi="Century Schoolbook"/>
-          <w:b/>
-          <w:bCs/>
-        </w:rPr>
-        <w:t>minSup</w:t>
-      </w:r>
-      <w:proofErr w:type="spellEnd"/>
-      <w:r>
-        <w:rPr>
-          <w:rFonts w:ascii="Century Schoolbook" w:hAnsi="Century Schoolbook"/>
-          <w:b/>
-          <w:bCs/>
-        </w:rPr>
-        <w:t>:</w:t>
-      </w:r>
-    </w:p>
-    <w:p>
-      <w:pPr>
-        <w:jc w:val="both"/>
-        <w:rPr>
-          <w:rFonts w:ascii="Century Schoolbook" w:hAnsi="Century Schoolbook"/>
-        </w:rPr>
-      </w:pPr>
-      <w:r>
-        <w:rPr>
-          <w:rFonts w:ascii="Century Schoolbook" w:hAnsi="Century Schoolbook"/>
-          <w:b/>
-          <w:bCs/>
-        </w:rPr>
-        <w:t>Answer (</w:t>
-      </w:r>
-      <w:proofErr w:type="gramStart"/>
-      <w:r>
-        <w:rPr>
-          <w:rFonts w:ascii="Century Schoolbook" w:hAnsi="Century Schoolbook"/>
-          <w:b/>
-          <w:bCs/>
-        </w:rPr>
-        <w:t>3) —</w:t>
-      </w:r>
-      <w:proofErr w:type="gramEnd"/>
-      <w:r>
-        <w:rPr>
-          <w:rFonts w:ascii="Century Schoolbook" w:hAnsi="Century Schoolbook"/>
-          <w:b/>
-          <w:bCs/>
-        </w:rPr>
-        <w:t xml:space="preserve"> Maximal vs standard frequent patterns:</w:t>
+      <w:r>
+        <w:rPr>
+          <w:rFonts w:ascii="Century Schoolbook" w:hAnsi="Century Schoolbook"/>
+          <w:b/>
+          <w:bCs/>
+        </w:rPr>
+        <w:t>Different dimensions</w:t>
+      </w:r>
+    </w:p>
+    <w:p>
+      <w:pPr>
+        <w:jc w:val="both"/>
+        <w:rPr>
+          <w:rFonts w:ascii="Century Schoolbook" w:hAnsi="Century Schoolbook" w:hint="eastAsia"/>
+        </w:rPr>
+      </w:pPr>
+      <w:r>
+        <w:rPr>
+          <w:rFonts w:ascii="Century Schoolbook" w:hAnsi="Century Schoolbook"/>
+          <w:b/>
+          <w:bCs/>
+        </w:rPr>
+        <w:t>Answer (3) — Maximal vs standard frequent patterns:</w:t>
+      </w:r>
+      <w:r>
+        <w:rPr>
+          <w:rFonts w:ascii="Century Schoolbook" w:hAnsi="Century Schoolbook"/>
+          <w:b/>
+          <w:bCs/>
+        </w:rPr>
+        <w:t xml:space="preserve"> discard the exact support values of these</w:t>
+      </w:r>
+      <w:r>
+        <w:rPr>
+          <w:rFonts w:ascii="Century Schoolbook" w:hAnsi="Century Schoolbook" w:hint="eastAsia"/>
+          <w:b/>
+          <w:bCs/>
+        </w:rPr>
+        <w:t xml:space="preserve"> </w:t>
+      </w:r>
+      <w:r>
+        <w:rPr>
+          <w:rFonts w:ascii="Century Schoolbook" w:hAnsi="Century Schoolbook"/>
+          <w:b/>
+          <w:bCs/>
+        </w:rPr>
+        <w:t>intermediate subsets</w:t>
       </w:r>
     </w:p>
     <w:p>
@@ -4092,7 +4508,7 @@
         <w:rPr>
           <w:rFonts w:ascii="Century Schoolbook" w:hAnsi="Century Schoolbook"/>
         </w:rPr>
-        <w:t xml:space="preserve"> Yes / No </w:t>
+        <w:t xml:space="preserve"> Yes</w:t>
       </w:r>
     </w:p>
     <w:p>
@@ -4116,6 +4532,12 @@
         </w:rPr>
         <w:t xml:space="preserve"> </w:t>
       </w:r>
+      <w:r>
+        <w:rPr>
+          <w:rFonts w:ascii="Century Schoolbook" w:hAnsi="Century Schoolbook"/>
+        </w:rPr>
+        <w:t>concept explanation and translating my ideas into English</w:t>
+      </w:r>
     </w:p>
     <w:p>
       <w:pPr>
@@ -4137,6 +4559,12 @@
           <w:rFonts w:ascii="Century Schoolbook" w:hAnsi="Century Schoolbook"/>
         </w:rPr>
         <w:t xml:space="preserve"> </w:t>
+      </w:r>
+      <w:r>
+        <w:rPr>
+          <w:rFonts w:ascii="Century Schoolbook" w:hAnsi="Century Schoolbook"/>
+        </w:rPr>
+        <w:t>https://www.philippe-fournier-viger.com/spmf/FPMax.php</w:t>
       </w:r>
     </w:p>
     <w:p>
@@ -4170,7 +4598,6 @@
           <w:b/>
           <w:bCs/>
         </w:rPr>
-        <w:lastRenderedPageBreak/>
         <w:t>Question 8: Dimensionality Reduction — Motivation</w:t>
       </w:r>
     </w:p>
@@ -4254,7 +4681,7 @@
     </w:p>
     <w:p>
       <w:pPr>
-        <w:pStyle w:val="ListParagraph"/>
+        <w:pStyle w:val="a9"/>
         <w:numPr>
           <w:ilvl w:val="0"/>
           <w:numId w:val="20"/>
@@ -4268,7 +4695,19 @@
         <w:rPr>
           <w:rFonts w:ascii="Century Schoolbook" w:hAnsi="Century Schoolbook"/>
         </w:rPr>
-        <w:t xml:space="preserve">If we want to visually map how these documents group by category on a scatter plot, why is it mathematically and visually impossible to plot the raw </w:t>
+        <w:t>If we</w:t>
+      </w:r>
+      <w:r>
+        <w:rPr>
+          <w:rFonts w:ascii="Century Schoolbook" w:hAnsi="Century Schoolbook" w:hint="eastAsia"/>
+        </w:rPr>
+        <w:t xml:space="preserve"> </w:t>
+      </w:r>
+      <w:r>
+        <w:rPr>
+          <w:rFonts w:ascii="Century Schoolbook" w:hAnsi="Century Schoolbook"/>
+        </w:rPr>
+        <w:t xml:space="preserve">want to visually map how these documents group by category on a scatter plot, why is it mathematically and visually impossible to plot the raw </w:t>
       </w:r>
       <w:proofErr w:type="spellStart"/>
       <w:r>
@@ -4289,7 +4728,7 @@
     </w:p>
     <w:p>
       <w:pPr>
-        <w:pStyle w:val="ListParagraph"/>
+        <w:pStyle w:val="a9"/>
         <w:numPr>
           <w:ilvl w:val="0"/>
           <w:numId w:val="20"/>
@@ -4311,6 +4750,8 @@
         <w:jc w:val="both"/>
         <w:rPr>
           <w:rFonts w:ascii="Century Schoolbook" w:hAnsi="Century Schoolbook"/>
+          <w:b/>
+          <w:bCs/>
         </w:rPr>
       </w:pPr>
       <w:r>
@@ -4327,6 +4768,91 @@
         <w:jc w:val="both"/>
         <w:rPr>
           <w:rFonts w:ascii="Century Schoolbook" w:hAnsi="Century Schoolbook"/>
+          <w:b/>
+          <w:bCs/>
+        </w:rPr>
+      </w:pPr>
+      <w:r>
+        <w:rPr>
+          <w:rFonts w:hint="eastAsia"/>
+        </w:rPr>
+        <w:t>1.c</w:t>
+      </w:r>
+      <w:r>
+        <w:rPr>
+          <w:rFonts w:ascii="Century Schoolbook" w:hAnsi="Century Schoolbook"/>
+          <w:b/>
+          <w:bCs/>
+        </w:rPr>
+        <w:t>omputers</w:t>
+      </w:r>
+      <w:r>
+        <w:rPr>
+          <w:rFonts w:ascii="Century Schoolbook" w:hAnsi="Century Schoolbook" w:hint="eastAsia"/>
+          <w:b/>
+          <w:bCs/>
+        </w:rPr>
+        <w:t xml:space="preserve"> </w:t>
+      </w:r>
+      <w:r>
+        <w:rPr>
+          <w:rFonts w:ascii="Century Schoolbook" w:hAnsi="Century Schoolbook"/>
+          <w:b/>
+          <w:bCs/>
+        </w:rPr>
+        <w:t>and paper</w:t>
+      </w:r>
+      <w:r>
+        <w:rPr>
+          <w:rFonts w:ascii="Century Schoolbook" w:hAnsi="Century Schoolbook" w:hint="eastAsia"/>
+          <w:b/>
+          <w:bCs/>
+        </w:rPr>
+        <w:t xml:space="preserve"> are </w:t>
+      </w:r>
+      <w:r>
+        <w:rPr>
+          <w:rFonts w:ascii="Century Schoolbook" w:hAnsi="Century Schoolbook"/>
+          <w:b/>
+          <w:bCs/>
+        </w:rPr>
+        <w:t>two-dimensional, while matrices are multi-dimensional</w:t>
+      </w:r>
+    </w:p>
+    <w:p>
+      <w:pPr>
+        <w:jc w:val="both"/>
+        <w:rPr>
+          <w:rFonts w:ascii="Century Schoolbook" w:hAnsi="Century Schoolbook" w:hint="eastAsia"/>
+          <w:b/>
+          <w:bCs/>
+        </w:rPr>
+      </w:pPr>
+      <w:r>
+        <w:rPr>
+          <w:rFonts w:ascii="Century Schoolbook" w:hAnsi="Century Schoolbook" w:hint="eastAsia"/>
+          <w:b/>
+          <w:bCs/>
+        </w:rPr>
+        <w:t>2.</w:t>
+      </w:r>
+      <w:r>
+        <w:t xml:space="preserve"> </w:t>
+      </w:r>
+      <w:r>
+        <w:rPr>
+          <w:rFonts w:ascii="Century Schoolbook" w:hAnsi="Century Schoolbook"/>
+          <w:b/>
+          <w:bCs/>
+        </w:rPr>
+        <w:t>Dimensionality reduction</w:t>
+      </w:r>
+    </w:p>
+    <w:p>
+      <w:pPr>
+        <w:jc w:val="both"/>
+        <w:rPr>
+          <w:rFonts w:ascii="Century Schoolbook" w:hAnsi="Century Schoolbook"/>
         </w:rPr>
       </w:pPr>
       <w:r>
@@ -4341,7 +4867,7 @@
         <w:rPr>
           <w:rFonts w:ascii="Century Schoolbook" w:hAnsi="Century Schoolbook"/>
         </w:rPr>
-        <w:t xml:space="preserve"> Yes / No </w:t>
+        <w:t xml:space="preserve"> No </w:t>
       </w:r>
     </w:p>
     <w:p>
@@ -4379,6 +4905,7 @@
           <w:b/>
           <w:bCs/>
         </w:rPr>
+        <w:lastRenderedPageBreak/>
         <w:t>External references (links):</w:t>
       </w:r>
       <w:r>
@@ -4536,7 +5063,7 @@
     </w:p>
     <w:p>
       <w:pPr>
-        <w:pStyle w:val="ListParagraph"/>
+        <w:pStyle w:val="a9"/>
         <w:numPr>
           <w:ilvl w:val="0"/>
           <w:numId w:val="21"/>
@@ -4569,7 +5096,7 @@
     </w:p>
     <w:p>
       <w:pPr>
-        <w:pStyle w:val="ListParagraph"/>
+        <w:pStyle w:val="a9"/>
         <w:numPr>
           <w:ilvl w:val="0"/>
           <w:numId w:val="21"/>
@@ -4630,7 +5157,7 @@
     </w:p>
     <w:p>
       <w:pPr>
-        <w:pStyle w:val="ListParagraph"/>
+        <w:pStyle w:val="a9"/>
         <w:numPr>
           <w:ilvl w:val="0"/>
           <w:numId w:val="21"/>
@@ -4666,6 +5193,8 @@
         <w:jc w:val="both"/>
         <w:rPr>
           <w:rFonts w:ascii="Century Schoolbook" w:hAnsi="Century Schoolbook"/>
+          <w:b/>
+          <w:bCs/>
         </w:rPr>
       </w:pPr>
       <w:r>
@@ -4682,6 +5211,73 @@
         <w:jc w:val="both"/>
         <w:rPr>
           <w:rFonts w:ascii="Century Schoolbook" w:hAnsi="Century Schoolbook"/>
+          <w:b/>
+          <w:bCs/>
+        </w:rPr>
+      </w:pPr>
+      <w:r>
+        <w:rPr>
+          <w:rFonts w:ascii="Century Schoolbook" w:hAnsi="Century Schoolbook" w:hint="eastAsia"/>
+          <w:b/>
+          <w:bCs/>
+        </w:rPr>
+        <w:t>1.</w:t>
+      </w:r>
+      <w:r>
+        <w:rPr>
+          <w:rFonts w:ascii="Century Schoolbook" w:hAnsi="Century Schoolbook"/>
+          <w:b/>
+          <w:bCs/>
+        </w:rPr>
+        <w:t xml:space="preserve"> </w:t>
+      </w:r>
+      <w:r>
+        <w:rPr>
+          <w:rFonts w:ascii="Century Schoolbook" w:hAnsi="Century Schoolbook"/>
+          <w:b/>
+          <w:bCs/>
+        </w:rPr>
+        <w:t>UMAP shows the clearest separation and PCA shows the worst</w:t>
+      </w:r>
+    </w:p>
+    <w:p>
+      <w:r>
+        <w:rPr>
+          <w:rFonts w:hint="eastAsia"/>
+        </w:rPr>
+        <w:t>2.</w:t>
+      </w:r>
+      <w:r>
+        <w:t xml:space="preserve"> </w:t>
+      </w:r>
+      <w:r>
+        <w:t>PCA is dominated by outliers</w:t>
+      </w:r>
+    </w:p>
+    <w:p>
+      <w:pPr>
+        <w:rPr>
+          <w:rFonts w:hint="eastAsia"/>
+        </w:rPr>
+      </w:pPr>
+      <w:r>
+        <w:rPr>
+          <w:rFonts w:hint="eastAsia"/>
+        </w:rPr>
+        <w:t>3.</w:t>
+      </w:r>
+      <w:r>
+        <w:t xml:space="preserve"> </w:t>
+      </w:r>
+      <w:r>
+        <w:t>t-SNE only focuses on preserving the local neighborhood structure of the high-dimensional space, and it does not guarantee that global distances are accurate.</w:t>
+      </w:r>
+    </w:p>
+    <w:p>
+      <w:pPr>
+        <w:jc w:val="both"/>
+        <w:rPr>
+          <w:rFonts w:ascii="Century Schoolbook" w:hAnsi="Century Schoolbook"/>
         </w:rPr>
       </w:pPr>
       <w:r>
@@ -4696,7 +5292,7 @@
         <w:rPr>
           <w:rFonts w:ascii="Century Schoolbook" w:hAnsi="Century Schoolbook"/>
         </w:rPr>
-        <w:t xml:space="preserve"> Yes / No </w:t>
+        <w:t xml:space="preserve"> Yes </w:t>
       </w:r>
     </w:p>
     <w:p>
@@ -4720,6 +5316,26 @@
         </w:rPr>
         <w:t xml:space="preserve"> </w:t>
       </w:r>
+      <w:r>
+        <w:rPr>
+          <w:rFonts w:ascii="Century Schoolbook" w:hAnsi="Century Schoolbook"/>
+        </w:rPr>
+        <w:t xml:space="preserve">concept explanation, a helper code snippet to rebuild </w:t>
+      </w:r>
+      <w:proofErr w:type="spellStart"/>
+      <w:r>
+        <w:rPr>
+          <w:rFonts w:ascii="Century Schoolbook" w:hAnsi="Century Schoolbook"/>
+        </w:rPr>
+        <w:t>tdm_df</w:t>
+      </w:r>
+      <w:proofErr w:type="spellEnd"/>
+      <w:r>
+        <w:rPr>
+          <w:rFonts w:ascii="Century Schoolbook" w:hAnsi="Century Schoolbook"/>
+        </w:rPr>
+        <w:t>, and translating my ideas into English</w:t>
+      </w:r>
     </w:p>
     <w:p>
       <w:pPr>
@@ -4742,59 +5358,78 @@
         </w:rPr>
         <w:t xml:space="preserve"> </w:t>
       </w:r>
-    </w:p>
-    <w:p>
-      <w:pPr>
-        <w:jc w:val="both"/>
-        <w:rPr>
-          <w:rFonts w:ascii="Century Schoolbook" w:hAnsi="Century Schoolbook"/>
-        </w:rPr>
-      </w:pPr>
-    </w:p>
-    <w:p>
-      <w:pPr>
-        <w:jc w:val="both"/>
-        <w:rPr>
-          <w:rFonts w:ascii="Century Schoolbook" w:hAnsi="Century Schoolbook"/>
-        </w:rPr>
-      </w:pPr>
-    </w:p>
-    <w:p>
-      <w:pPr>
-        <w:jc w:val="both"/>
-        <w:rPr>
-          <w:rFonts w:ascii="Century Schoolbook" w:hAnsi="Century Schoolbook"/>
-        </w:rPr>
-      </w:pPr>
-    </w:p>
-    <w:p>
-      <w:pPr>
-        <w:jc w:val="both"/>
-        <w:rPr>
-          <w:rFonts w:ascii="Century Schoolbook" w:hAnsi="Century Schoolbook"/>
-        </w:rPr>
-      </w:pPr>
-    </w:p>
-    <w:p>
-      <w:pPr>
-        <w:jc w:val="both"/>
-        <w:rPr>
-          <w:rFonts w:ascii="Century Schoolbook" w:hAnsi="Century Schoolbook"/>
-        </w:rPr>
-      </w:pPr>
-    </w:p>
-    <w:p>
-      <w:pPr>
-        <w:jc w:val="both"/>
-        <w:rPr>
-          <w:rFonts w:ascii="Century Schoolbook" w:hAnsi="Century Schoolbook"/>
-        </w:rPr>
-      </w:pPr>
-      <w:r>
-        <w:rPr>
-          <w:rFonts w:ascii="Century Schoolbook" w:hAnsi="Century Schoolbook"/>
-        </w:rPr>
-        <w:lastRenderedPageBreak/>
+      <w:r>
+        <w:rPr>
+          <w:rFonts w:ascii="Century Schoolbook" w:hAnsi="Century Schoolbook"/>
+        </w:rPr>
+        <w:t>https://distill.pub/2016/misread-tsne/</w:t>
+      </w:r>
+    </w:p>
+    <w:p>
+      <w:pPr>
+        <w:jc w:val="both"/>
+        <w:rPr>
+          <w:rFonts w:ascii="Century Schoolbook" w:hAnsi="Century Schoolbook"/>
+        </w:rPr>
+      </w:pPr>
+      <w:r>
+        <w:rPr>
+          <w:rFonts w:ascii="Century Schoolbook" w:hAnsi="Century Schoolbook"/>
+        </w:rPr>
+        <w:t>https://scikit-learn.org/stable/modules/generated/sklearn.decomposition.PCA.html</w:t>
+      </w:r>
+    </w:p>
+    <w:p>
+      <w:pPr>
+        <w:jc w:val="both"/>
+        <w:rPr>
+          <w:rFonts w:ascii="Century Schoolbook" w:hAnsi="Century Schoolbook"/>
+        </w:rPr>
+      </w:pPr>
+    </w:p>
+    <w:p>
+      <w:pPr>
+        <w:jc w:val="both"/>
+        <w:rPr>
+          <w:rFonts w:ascii="Century Schoolbook" w:hAnsi="Century Schoolbook"/>
+        </w:rPr>
+      </w:pPr>
+    </w:p>
+    <w:p>
+      <w:pPr>
+        <w:jc w:val="both"/>
+        <w:rPr>
+          <w:rFonts w:ascii="Century Schoolbook" w:hAnsi="Century Schoolbook"/>
+        </w:rPr>
+      </w:pPr>
+    </w:p>
+    <w:p>
+      <w:pPr>
+        <w:jc w:val="both"/>
+        <w:rPr>
+          <w:rFonts w:ascii="Century Schoolbook" w:hAnsi="Century Schoolbook"/>
+        </w:rPr>
+      </w:pPr>
+    </w:p>
+    <w:p>
+      <w:pPr>
+        <w:jc w:val="both"/>
+        <w:rPr>
+          <w:rFonts w:ascii="Century Schoolbook" w:hAnsi="Century Schoolbook"/>
+        </w:rPr>
+      </w:pPr>
+    </w:p>
+    <w:p>
+      <w:pPr>
+        <w:jc w:val="both"/>
+        <w:rPr>
+          <w:rFonts w:ascii="Century Schoolbook" w:hAnsi="Century Schoolbook"/>
+        </w:rPr>
+      </w:pPr>
+      <w:r>
+        <w:rPr>
+          <w:rFonts w:ascii="Century Schoolbook" w:hAnsi="Century Schoolbook"/>
+        </w:rPr>
         <w:pict w14:anchorId="3E56138F">
           <v:rect id="_x0000_i1036" style="width:0;height:1.5pt" o:hralign="center" o:hrstd="t" o:hr="t" fillcolor="#a0a0a0" stroked="f"/>
         </w:pict>
@@ -4907,12 +5542,13 @@
           <w:b/>
           <w:bCs/>
         </w:rPr>
+        <w:lastRenderedPageBreak/>
         <w:t>Questions:</w:t>
       </w:r>
     </w:p>
     <w:p>
       <w:pPr>
-        <w:pStyle w:val="ListParagraph"/>
+        <w:pStyle w:val="a9"/>
         <w:numPr>
           <w:ilvl w:val="0"/>
           <w:numId w:val="23"/>
@@ -4931,7 +5567,7 @@
     </w:p>
     <w:p>
       <w:pPr>
-        <w:pStyle w:val="ListParagraph"/>
+        <w:pStyle w:val="a9"/>
         <w:numPr>
           <w:ilvl w:val="0"/>
           <w:numId w:val="23"/>
@@ -4964,7 +5600,7 @@
     </w:p>
     <w:p>
       <w:pPr>
-        <w:pStyle w:val="ListParagraph"/>
+        <w:pStyle w:val="a9"/>
         <w:numPr>
           <w:ilvl w:val="0"/>
           <w:numId w:val="23"/>
@@ -4983,18 +5619,20 @@
     </w:p>
     <w:p>
       <w:pPr>
-        <w:pStyle w:val="ListParagraph"/>
-        <w:jc w:val="both"/>
-        <w:rPr>
-          <w:rFonts w:ascii="Century Schoolbook" w:hAnsi="Century Schoolbook"/>
-        </w:rPr>
-      </w:pPr>
-    </w:p>
-    <w:p>
-      <w:pPr>
-        <w:jc w:val="both"/>
-        <w:rPr>
-          <w:rFonts w:ascii="Century Schoolbook" w:hAnsi="Century Schoolbook"/>
+        <w:pStyle w:val="a9"/>
+        <w:jc w:val="both"/>
+        <w:rPr>
+          <w:rFonts w:ascii="Century Schoolbook" w:hAnsi="Century Schoolbook"/>
+        </w:rPr>
+      </w:pPr>
+    </w:p>
+    <w:p>
+      <w:pPr>
+        <w:jc w:val="both"/>
+        <w:rPr>
+          <w:rFonts w:ascii="Century Schoolbook" w:hAnsi="Century Schoolbook"/>
+          <w:b/>
+          <w:bCs/>
         </w:rPr>
       </w:pPr>
       <w:r>
@@ -5011,6 +5649,73 @@
         <w:jc w:val="both"/>
         <w:rPr>
           <w:rFonts w:ascii="Century Schoolbook" w:hAnsi="Century Schoolbook"/>
+          <w:b/>
+          <w:bCs/>
+        </w:rPr>
+      </w:pPr>
+      <w:r>
+        <w:rPr>
+          <w:rFonts w:ascii="Century Schoolbook" w:hAnsi="Century Schoolbook" w:hint="eastAsia"/>
+          <w:b/>
+          <w:bCs/>
+        </w:rPr>
+        <w:t>1.</w:t>
+      </w:r>
+      <w:r>
+        <w:rPr>
+          <w:rFonts w:ascii="Century Schoolbook" w:hAnsi="Century Schoolbook"/>
+          <w:b/>
+          <w:bCs/>
+        </w:rPr>
+        <w:t xml:space="preserve"> </w:t>
+      </w:r>
+      <w:r>
+        <w:rPr>
+          <w:rFonts w:ascii="Century Schoolbook" w:hAnsi="Century Schoolbook"/>
+          <w:b/>
+          <w:bCs/>
+        </w:rPr>
+        <w:t>4 binary columns are created</w:t>
+      </w:r>
+    </w:p>
+    <w:p>
+      <w:r>
+        <w:rPr>
+          <w:rFonts w:hint="eastAsia"/>
+        </w:rPr>
+        <w:t>2.</w:t>
+      </w:r>
+      <w:r>
+        <w:t xml:space="preserve"> </w:t>
+      </w:r>
+      <w:r>
+        <w:t>assumes a false order between the categories</w:t>
+      </w:r>
+    </w:p>
+    <w:p>
+      <w:pPr>
+        <w:rPr>
+          <w:rFonts w:hint="eastAsia"/>
+        </w:rPr>
+      </w:pPr>
+      <w:r>
+        <w:rPr>
+          <w:rFonts w:hint="eastAsia"/>
+        </w:rPr>
+        <w:t>3.</w:t>
+      </w:r>
+      <w:r>
+        <w:t xml:space="preserve"> </w:t>
+      </w:r>
+      <w:r>
+        <w:t>no order and no bias</w:t>
+      </w:r>
+    </w:p>
+    <w:p>
+      <w:pPr>
+        <w:jc w:val="both"/>
+        <w:rPr>
+          <w:rFonts w:ascii="Century Schoolbook" w:hAnsi="Century Schoolbook"/>
         </w:rPr>
       </w:pPr>
       <w:r>
@@ -5025,7 +5730,7 @@
         <w:rPr>
           <w:rFonts w:ascii="Century Schoolbook" w:hAnsi="Century Schoolbook"/>
         </w:rPr>
-        <w:t xml:space="preserve"> Yes / No </w:t>
+        <w:t xml:space="preserve"> Yes </w:t>
       </w:r>
     </w:p>
     <w:p>
@@ -5049,14 +5754,18 @@
         </w:rPr>
         <w:t xml:space="preserve"> </w:t>
       </w:r>
-    </w:p>
-    <w:p>
-      <w:pPr>
-        <w:jc w:val="both"/>
-        <w:rPr>
-          <w:rFonts w:ascii="Century Schoolbook" w:hAnsi="Century Schoolbook"/>
-        </w:rPr>
-      </w:pPr>
+      <w:r>
+        <w:rPr>
+          <w:rFonts w:ascii="Century Schoolbook" w:hAnsi="Century Schoolbook"/>
+        </w:rPr>
+        <w:t>concept explanation and translating my ideas into English</w:t>
+      </w:r>
+      <w:r>
+        <w:rPr>
+          <w:rFonts w:ascii="Century Schoolbook" w:hAnsi="Century Schoolbook"/>
+        </w:rPr>
+        <w:t xml:space="preserve"> </w:t>
+      </w:r>
       <w:r>
         <w:rPr>
           <w:rFonts w:ascii="Century Schoolbook" w:hAnsi="Century Schoolbook"/>
@@ -5070,6 +5779,12 @@
           <w:rFonts w:ascii="Century Schoolbook" w:hAnsi="Century Schoolbook"/>
         </w:rPr>
         <w:t xml:space="preserve"> </w:t>
+      </w:r>
+      <w:r>
+        <w:rPr>
+          <w:rFonts w:ascii="Century Schoolbook" w:hAnsi="Century Schoolbook"/>
+        </w:rPr>
+        <w:t>https://scikit-learn.org/stable/modules/preprocessing.html#encoding-categorical-features</w:t>
       </w:r>
     </w:p>
     <w:p>
@@ -5099,7 +5814,7 @@
 </file>
 
 <file path=word/endnotes.xml><?xml version="1.0" encoding="utf-8"?>
-<w:endnotes xmlns:wpc="http://schemas.microsoft.com/office/word/2010/wordprocessingCanvas" xmlns:cx="http://schemas.microsoft.com/office/drawing/2014/chartex" xmlns:cx1="http://schemas.microsoft.com/office/drawing/2015/9/8/chartex" xmlns:cx2="http://schemas.microsoft.com/office/drawing/2015/10/21/chartex" xmlns:cx3="http://schemas.microsoft.com/office/drawing/2016/5/9/chartex" xmlns:cx4="http://schemas.microsoft.com/office/drawing/2016/5/10/chartex" xmlns:cx5="http://schemas.microsoft.com/office/drawing/2016/5/11/chartex" xmlns:cx6="http://schemas.microsoft.com/office/drawing/2016/5/12/chartex" xmlns:cx7="http://schemas.microsoft.com/office/drawing/2016/5/13/chartex" xmlns:cx8="http://schemas.microsoft.com/office/drawing/2016/5/14/chartex" xmlns:mc="http://schemas.openxmlformats.org/markup-compatibility/2006" xmlns:aink="http://schemas.microsoft.com/office/drawing/2016/ink" xmlns:am3d="http://schemas.microsoft.com/office/drawing/2017/model3d" xmlns:o="urn:schemas-microsoft-com:office:office" xmlns:oel="http://schemas.microsoft.com/office/2019/extlst" xmlns:r="http://schemas.openxmlformats.org/officeDocument/2006/relationships" xmlns:m="http://schemas.openxmlformats.org/officeDocument/2006/math" xmlns:v="urn:schemas-microsoft-com:vml" xmlns:wp14="http://schemas.microsoft.com/office/word/2010/wordprocessingDrawing" xmlns:wp="http://schemas.openxmlformats.org/drawingml/2006/wordprocessingDrawing" xmlns:w10="urn:schemas-microsoft-com:office:word" xmlns:w="http://schemas.openxmlformats.org/wordprocessingml/2006/main" xmlns:w14="http://schemas.microsoft.com/office/word/2010/wordml" xmlns:w15="http://schemas.microsoft.com/office/word/2012/wordml" xmlns:w16cex="http://schemas.microsoft.com/office/word/2018/wordml/cex" xmlns:w16cid="http://schemas.microsoft.com/office/word/2016/wordml/cid" xmlns:w16="http://schemas.microsoft.com/office/word/2018/wordml" xmlns:w16du="http://schemas.microsoft.com/office/word/2023/wordml/word16du" xmlns:w16sdtdh="http://schemas.microsoft.com/office/word/2020/wordml/sdtdatahash" xmlns:w16sdtfl="http://schemas.microsoft.com/office/word/2024/wordml/sdtformatlock" xmlns:w16se="http://schemas.microsoft.com/office/word/2015/wordml/symex" xmlns:wpg="http://schemas.microsoft.com/office/word/2010/wordprocessingGroup" xmlns:wpi="http://schemas.microsoft.com/office/word/2010/wordprocessingInk" xmlns:wne="http://schemas.microsoft.com/office/word/2006/wordml" xmlns:wps="http://schemas.microsoft.com/office/word/2010/wordprocessingShape" mc:Ignorable="w14 w15 w16se w16cid w16 w16cex w16sdtdh w16sdtfl w16du wp14">
+<w:endnotes xmlns:wpc="http://schemas.microsoft.com/office/word/2010/wordprocessingCanvas" xmlns:cx="http://schemas.microsoft.com/office/drawing/2014/chartex" xmlns:cx1="http://schemas.microsoft.com/office/drawing/2015/9/8/chartex" xmlns:cx2="http://schemas.microsoft.com/office/drawing/2015/10/21/chartex" xmlns:cx3="http://schemas.microsoft.com/office/drawing/2016/5/9/chartex" xmlns:cx4="http://schemas.microsoft.com/office/drawing/2016/5/10/chartex" xmlns:cx5="http://schemas.microsoft.com/office/drawing/2016/5/11/chartex" xmlns:cx6="http://schemas.microsoft.com/office/drawing/2016/5/12/chartex" xmlns:cx7="http://schemas.microsoft.com/office/drawing/2016/5/13/chartex" xmlns:cx8="http://schemas.microsoft.com/office/drawing/2016/5/14/chartex" xmlns:mc="http://schemas.openxmlformats.org/markup-compatibility/2006" xmlns:aink="http://schemas.microsoft.com/office/drawing/2016/ink" xmlns:am3d="http://schemas.microsoft.com/office/drawing/2017/model3d" xmlns:o="urn:schemas-microsoft-com:office:office" xmlns:oel="http://schemas.microsoft.com/office/2019/extlst" xmlns:r="http://schemas.openxmlformats.org/officeDocument/2006/relationships" xmlns:m="http://schemas.openxmlformats.org/officeDocument/2006/math" xmlns:v="urn:schemas-microsoft-com:vml" xmlns:wp14="http://schemas.microsoft.com/office/word/2010/wordprocessingDrawing" xmlns:wp="http://schemas.openxmlformats.org/drawingml/2006/wordprocessingDrawing" xmlns:w10="urn:schemas-microsoft-com:office:word" xmlns:w="http://schemas.openxmlformats.org/wordprocessingml/2006/main" xmlns:w14="http://schemas.microsoft.com/office/word/2010/wordml" xmlns:w15="http://schemas.microsoft.com/office/word/2012/wordml" xmlns:w16cex="http://schemas.microsoft.com/office/word/2018/wordml/cex" xmlns:w16cid="http://schemas.microsoft.com/office/word/2016/wordml/cid" xmlns:w16="http://schemas.microsoft.com/office/word/2018/wordml" xmlns:w16sdtdh="http://schemas.microsoft.com/office/word/2020/wordml/sdtdatahash" xmlns:w16se="http://schemas.microsoft.com/office/word/2015/wordml/symex" xmlns:wpg="http://schemas.microsoft.com/office/word/2010/wordprocessingGroup" xmlns:wpi="http://schemas.microsoft.com/office/word/2010/wordprocessingInk" xmlns:wne="http://schemas.microsoft.com/office/word/2006/wordml" xmlns:wps="http://schemas.microsoft.com/office/word/2010/wordprocessingShape" mc:Ignorable="w14 w15 w16se w16cid w16 w16cex w16sdtdh wp14">
   <w:endnote w:type="separator" w:id="-1">
     <w:p>
       <w:pPr>
@@ -5124,7 +5839,7 @@
 </file>
 
 <file path=word/footnotes.xml><?xml version="1.0" encoding="utf-8"?>
-<w:footnotes xmlns:wpc="http://schemas.microsoft.com/office/word/2010/wordprocessingCanvas" xmlns:cx="http://schemas.microsoft.com/office/drawing/2014/chartex" xmlns:cx1="http://schemas.microsoft.com/office/drawing/2015/9/8/chartex" xmlns:cx2="http://schemas.microsoft.com/office/drawing/2015/10/21/chartex" xmlns:cx3="http://schemas.microsoft.com/office/drawing/2016/5/9/chartex" xmlns:cx4="http://schemas.microsoft.com/office/drawing/2016/5/10/chartex" xmlns:cx5="http://schemas.microsoft.com/office/drawing/2016/5/11/chartex" xmlns:cx6="http://schemas.microsoft.com/office/drawing/2016/5/12/chartex" xmlns:cx7="http://schemas.microsoft.com/office/drawing/2016/5/13/chartex" xmlns:cx8="http://schemas.microsoft.com/office/drawing/2016/5/14/chartex" xmlns:mc="http://schemas.openxmlformats.org/markup-compatibility/2006" xmlns:aink="http://schemas.microsoft.com/office/drawing/2016/ink" xmlns:am3d="http://schemas.microsoft.com/office/drawing/2017/model3d" xmlns:o="urn:schemas-microsoft-com:office:office" xmlns:oel="http://schemas.microsoft.com/office/2019/extlst" xmlns:r="http://schemas.openxmlformats.org/officeDocument/2006/relationships" xmlns:m="http://schemas.openxmlformats.org/officeDocument/2006/math" xmlns:v="urn:schemas-microsoft-com:vml" xmlns:wp14="http://schemas.microsoft.com/office/word/2010/wordprocessingDrawing" xmlns:wp="http://schemas.openxmlformats.org/drawingml/2006/wordprocessingDrawing" xmlns:w10="urn:schemas-microsoft-com:office:word" xmlns:w="http://schemas.openxmlformats.org/wordprocessingml/2006/main" xmlns:w14="http://schemas.microsoft.com/office/word/2010/wordml" xmlns:w15="http://schemas.microsoft.com/office/word/2012/wordml" xmlns:w16cex="http://schemas.microsoft.com/office/word/2018/wordml/cex" xmlns:w16cid="http://schemas.microsoft.com/office/word/2016/wordml/cid" xmlns:w16="http://schemas.microsoft.com/office/word/2018/wordml" xmlns:w16du="http://schemas.microsoft.com/office/word/2023/wordml/word16du" xmlns:w16sdtdh="http://schemas.microsoft.com/office/word/2020/wordml/sdtdatahash" xmlns:w16sdtfl="http://schemas.microsoft.com/office/word/2024/wordml/sdtformatlock" xmlns:w16se="http://schemas.microsoft.com/office/word/2015/wordml/symex" xmlns:wpg="http://schemas.microsoft.com/office/word/2010/wordprocessingGroup" xmlns:wpi="http://schemas.microsoft.com/office/word/2010/wordprocessingInk" xmlns:wne="http://schemas.microsoft.com/office/word/2006/wordml" xmlns:wps="http://schemas.microsoft.com/office/word/2010/wordprocessingShape" mc:Ignorable="w14 w15 w16se w16cid w16 w16cex w16sdtdh w16sdtfl w16du wp14">
+<w:footnotes xmlns:wpc="http://schemas.microsoft.com/office/word/2010/wordprocessingCanvas" xmlns:cx="http://schemas.microsoft.com/office/drawing/2014/chartex" xmlns:cx1="http://schemas.microsoft.com/office/drawing/2015/9/8/chartex" xmlns:cx2="http://schemas.microsoft.com/office/drawing/2015/10/21/chartex" xmlns:cx3="http://schemas.microsoft.com/office/drawing/2016/5/9/chartex" xmlns:cx4="http://schemas.microsoft.com/office/drawing/2016/5/10/chartex" xmlns:cx5="http://schemas.microsoft.com/office/drawing/2016/5/11/chartex" xmlns:cx6="http://schemas.microsoft.com/office/drawing/2016/5/12/chartex" xmlns:cx7="http://schemas.microsoft.com/office/drawing/2016/5/13/chartex" xmlns:cx8="http://schemas.microsoft.com/office/drawing/2016/5/14/chartex" xmlns:mc="http://schemas.openxmlformats.org/markup-compatibility/2006" xmlns:aink="http://schemas.microsoft.com/office/drawing/2016/ink" xmlns:am3d="http://schemas.microsoft.com/office/drawing/2017/model3d" xmlns:o="urn:schemas-microsoft-com:office:office" xmlns:oel="http://schemas.microsoft.com/office/2019/extlst" xmlns:r="http://schemas.openxmlformats.org/officeDocument/2006/relationships" xmlns:m="http://schemas.openxmlformats.org/officeDocument/2006/math" xmlns:v="urn:schemas-microsoft-com:vml" xmlns:wp14="http://schemas.microsoft.com/office/word/2010/wordprocessingDrawing" xmlns:wp="http://schemas.openxmlformats.org/drawingml/2006/wordprocessingDrawing" xmlns:w10="urn:schemas-microsoft-com:office:word" xmlns:w="http://schemas.openxmlformats.org/wordprocessingml/2006/main" xmlns:w14="http://schemas.microsoft.com/office/word/2010/wordml" xmlns:w15="http://schemas.microsoft.com/office/word/2012/wordml" xmlns:w16cex="http://schemas.microsoft.com/office/word/2018/wordml/cex" xmlns:w16cid="http://schemas.microsoft.com/office/word/2016/wordml/cid" xmlns:w16="http://schemas.microsoft.com/office/word/2018/wordml" xmlns:w16sdtdh="http://schemas.microsoft.com/office/word/2020/wordml/sdtdatahash" xmlns:w16se="http://schemas.microsoft.com/office/word/2015/wordml/symex" xmlns:wpg="http://schemas.microsoft.com/office/word/2010/wordprocessingGroup" xmlns:wpi="http://schemas.microsoft.com/office/word/2010/wordprocessingInk" xmlns:wne="http://schemas.microsoft.com/office/word/2006/wordml" xmlns:wps="http://schemas.microsoft.com/office/word/2010/wordprocessingShape" mc:Ignorable="w14 w15 w16se w16cid w16 w16cex w16sdtdh wp14">
   <w:footnote w:type="separator" w:id="-1">
     <w:p>
       <w:pPr>
@@ -5149,7 +5864,7 @@
 </file>
 
 <file path=word/numbering.xml><?xml version="1.0" encoding="utf-8"?>
-<w:numbering xmlns:wpc="http://schemas.microsoft.com/office/word/2010/wordprocessingCanvas" xmlns:cx="http://schemas.microsoft.com/office/drawing/2014/chartex" xmlns:cx1="http://schemas.microsoft.com/office/drawing/2015/9/8/chartex" xmlns:cx2="http://schemas.microsoft.com/office/drawing/2015/10/21/chartex" xmlns:cx3="http://schemas.microsoft.com/office/drawing/2016/5/9/chartex" xmlns:cx4="http://schemas.microsoft.com/office/drawing/2016/5/10/chartex" xmlns:cx5="http://schemas.microsoft.com/office/drawing/2016/5/11/chartex" xmlns:cx6="http://schemas.microsoft.com/office/drawing/2016/5/12/chartex" xmlns:cx7="http://schemas.microsoft.com/office/drawing/2016/5/13/chartex" xmlns:cx8="http://schemas.microsoft.com/office/drawing/2016/5/14/chartex" xmlns:mc="http://schemas.openxmlformats.org/markup-compatibility/2006" xmlns:aink="http://schemas.microsoft.com/office/drawing/2016/ink" xmlns:am3d="http://schemas.microsoft.com/office/drawing/2017/model3d" xmlns:o="urn:schemas-microsoft-com:office:office" xmlns:oel="http://schemas.microsoft.com/office/2019/extlst" xmlns:r="http://schemas.openxmlformats.org/officeDocument/2006/relationships" xmlns:m="http://schemas.openxmlformats.org/officeDocument/2006/math" xmlns:v="urn:schemas-microsoft-com:vml" xmlns:wp14="http://schemas.microsoft.com/office/word/2010/wordprocessingDrawing" xmlns:wp="http://schemas.openxmlformats.org/drawingml/2006/wordprocessingDrawing" xmlns:w10="urn:schemas-microsoft-com:office:word" xmlns:w="http://schemas.openxmlformats.org/wordprocessingml/2006/main" xmlns:w14="http://schemas.microsoft.com/office/word/2010/wordml" xmlns:w15="http://schemas.microsoft.com/office/word/2012/wordml" xmlns:w16cex="http://schemas.microsoft.com/office/word/2018/wordml/cex" xmlns:w16cid="http://schemas.microsoft.com/office/word/2016/wordml/cid" xmlns:w16="http://schemas.microsoft.com/office/word/2018/wordml" xmlns:w16du="http://schemas.microsoft.com/office/word/2023/wordml/word16du" xmlns:w16sdtdh="http://schemas.microsoft.com/office/word/2020/wordml/sdtdatahash" xmlns:w16sdtfl="http://schemas.microsoft.com/office/word/2024/wordml/sdtformatlock" xmlns:w16se="http://schemas.microsoft.com/office/word/2015/wordml/symex" xmlns:wpg="http://schemas.microsoft.com/office/word/2010/wordprocessingGroup" xmlns:wpi="http://schemas.microsoft.com/office/word/2010/wordprocessingInk" xmlns:wne="http://schemas.microsoft.com/office/word/2006/wordml" xmlns:wps="http://schemas.microsoft.com/office/word/2010/wordprocessingShape" mc:Ignorable="w14 w15 w16se w16cid w16 w16cex w16sdtdh w16sdtfl w16du wp14">
+<w:numbering xmlns:wpc="http://schemas.microsoft.com/office/word/2010/wordprocessingCanvas" xmlns:cx="http://schemas.microsoft.com/office/drawing/2014/chartex" xmlns:cx1="http://schemas.microsoft.com/office/drawing/2015/9/8/chartex" xmlns:cx2="http://schemas.microsoft.com/office/drawing/2015/10/21/chartex" xmlns:cx3="http://schemas.microsoft.com/office/drawing/2016/5/9/chartex" xmlns:cx4="http://schemas.microsoft.com/office/drawing/2016/5/10/chartex" xmlns:cx5="http://schemas.microsoft.com/office/drawing/2016/5/11/chartex" xmlns:cx6="http://schemas.microsoft.com/office/drawing/2016/5/12/chartex" xmlns:cx7="http://schemas.microsoft.com/office/drawing/2016/5/13/chartex" xmlns:cx8="http://schemas.microsoft.com/office/drawing/2016/5/14/chartex" xmlns:mc="http://schemas.openxmlformats.org/markup-compatibility/2006" xmlns:aink="http://schemas.microsoft.com/office/drawing/2016/ink" xmlns:am3d="http://schemas.microsoft.com/office/drawing/2017/model3d" xmlns:o="urn:schemas-microsoft-com:office:office" xmlns:oel="http://schemas.microsoft.com/office/2019/extlst" xmlns:r="http://schemas.openxmlformats.org/officeDocument/2006/relationships" xmlns:m="http://schemas.openxmlformats.org/officeDocument/2006/math" xmlns:v="urn:schemas-microsoft-com:vml" xmlns:wp14="http://schemas.microsoft.com/office/word/2010/wordprocessingDrawing" xmlns:wp="http://schemas.openxmlformats.org/drawingml/2006/wordprocessingDrawing" xmlns:w10="urn:schemas-microsoft-com:office:word" xmlns:w="http://schemas.openxmlformats.org/wordprocessingml/2006/main" xmlns:w14="http://schemas.microsoft.com/office/word/2010/wordml" xmlns:w15="http://schemas.microsoft.com/office/word/2012/wordml" xmlns:w16cex="http://schemas.microsoft.com/office/word/2018/wordml/cex" xmlns:w16cid="http://schemas.microsoft.com/office/word/2016/wordml/cid" xmlns:w16="http://schemas.microsoft.com/office/word/2018/wordml" xmlns:w16sdtdh="http://schemas.microsoft.com/office/word/2020/wordml/sdtdatahash" xmlns:w16se="http://schemas.microsoft.com/office/word/2015/wordml/symex" xmlns:wpg="http://schemas.microsoft.com/office/word/2010/wordprocessingGroup" xmlns:wpi="http://schemas.microsoft.com/office/word/2010/wordprocessingInk" xmlns:wne="http://schemas.microsoft.com/office/word/2006/wordml" xmlns:wps="http://schemas.microsoft.com/office/word/2010/wordprocessingShape" mc:Ignorable="w14 w15 w16se w16cid w16 w16cex w16sdtdh wp14">
   <w:abstractNum w:abstractNumId="0" w15:restartNumberingAfterBreak="0">
     <w:nsid w:val="02604484"/>
     <w:multiLevelType w:val="multilevel"/>
@@ -5553,6 +6268,95 @@
     </w:lvl>
   </w:abstractNum>
   <w:abstractNum w:abstractNumId="3" w15:restartNumberingAfterBreak="0">
+    <w:nsid w:val="0A396938"/>
+    <w:multiLevelType w:val="hybridMultilevel"/>
+    <w:tmpl w:val="B380A710"/>
+    <w:lvl w:ilvl="0" w:tplc="DD42D8A4">
+      <w:start w:val="1"/>
+      <w:numFmt w:val="decimal"/>
+      <w:lvlText w:val="%1."/>
+      <w:lvlJc w:val="left"/>
+      <w:pPr>
+        <w:ind w:left="360" w:hanging="360"/>
+      </w:pPr>
+      <w:rPr>
+        <w:rFonts w:hint="default"/>
+      </w:rPr>
+    </w:lvl>
+    <w:lvl w:ilvl="1" w:tplc="04090019" w:tentative="1">
+      <w:start w:val="1"/>
+      <w:numFmt w:val="ideographTraditional"/>
+      <w:lvlText w:val="%2、"/>
+      <w:lvlJc w:val="left"/>
+      <w:pPr>
+        <w:ind w:left="960" w:hanging="480"/>
+      </w:pPr>
+    </w:lvl>
+    <w:lvl w:ilvl="2" w:tplc="0409001B" w:tentative="1">
+      <w:start w:val="1"/>
+      <w:numFmt w:val="lowerRoman"/>
+      <w:lvlText w:val="%3."/>
+      <w:lvlJc w:val="right"/>
+      <w:pPr>
+        <w:ind w:left="1440" w:hanging="480"/>
+      </w:pPr>
+    </w:lvl>
+    <w:lvl w:ilvl="3" w:tplc="0409000F" w:tentative="1">
+      <w:start w:val="1"/>
+      <w:numFmt w:val="decimal"/>
+      <w:lvlText w:val="%4."/>
+      <w:lvlJc w:val="left"/>
+      <w:pPr>
+        <w:ind w:left="1920" w:hanging="480"/>
+      </w:pPr>
+    </w:lvl>
+    <w:lvl w:ilvl="4" w:tplc="04090019" w:tentative="1">
+      <w:start w:val="1"/>
+      <w:numFmt w:val="ideographTraditional"/>
+      <w:lvlText w:val="%5、"/>
+      <w:lvlJc w:val="left"/>
+      <w:pPr>
+        <w:ind w:left="2400" w:hanging="480"/>
+      </w:pPr>
+    </w:lvl>
+    <w:lvl w:ilvl="5" w:tplc="0409001B" w:tentative="1">
+      <w:start w:val="1"/>
+      <w:numFmt w:val="lowerRoman"/>
+      <w:lvlText w:val="%6."/>
+      <w:lvlJc w:val="right"/>
+      <w:pPr>
+        <w:ind w:left="2880" w:hanging="480"/>
+      </w:pPr>
+    </w:lvl>
+    <w:lvl w:ilvl="6" w:tplc="0409000F" w:tentative="1">
+      <w:start w:val="1"/>
+      <w:numFmt w:val="decimal"/>
+      <w:lvlText w:val="%7."/>
+      <w:lvlJc w:val="left"/>
+      <w:pPr>
+        <w:ind w:left="3360" w:hanging="480"/>
+      </w:pPr>
+    </w:lvl>
+    <w:lvl w:ilvl="7" w:tplc="04090019" w:tentative="1">
+      <w:start w:val="1"/>
+      <w:numFmt w:val="ideographTraditional"/>
+      <w:lvlText w:val="%8、"/>
+      <w:lvlJc w:val="left"/>
+      <w:pPr>
+        <w:ind w:left="3840" w:hanging="480"/>
+      </w:pPr>
+    </w:lvl>
+    <w:lvl w:ilvl="8" w:tplc="0409001B" w:tentative="1">
+      <w:start w:val="1"/>
+      <w:numFmt w:val="lowerRoman"/>
+      <w:lvlText w:val="%9."/>
+      <w:lvlJc w:val="right"/>
+      <w:pPr>
+        <w:ind w:left="4320" w:hanging="480"/>
+      </w:pPr>
+    </w:lvl>
+  </w:abstractNum>
+  <w:abstractNum w:abstractNumId="4" w15:restartNumberingAfterBreak="0">
     <w:nsid w:val="11354C56"/>
     <w:multiLevelType w:val="hybridMultilevel"/>
     <w:tmpl w:val="7BCE20E2"/>
@@ -5665,7 +6469,7 @@
       </w:rPr>
     </w:lvl>
   </w:abstractNum>
-  <w:abstractNum w:abstractNumId="4" w15:restartNumberingAfterBreak="0">
+  <w:abstractNum w:abstractNumId="5" w15:restartNumberingAfterBreak="0">
     <w:nsid w:val="1E4E49AF"/>
     <w:multiLevelType w:val="hybridMultilevel"/>
     <w:tmpl w:val="605866CA"/>
@@ -5754,7 +6558,96 @@
       </w:pPr>
     </w:lvl>
   </w:abstractNum>
-  <w:abstractNum w:abstractNumId="5" w15:restartNumberingAfterBreak="0">
+  <w:abstractNum w:abstractNumId="6" w15:restartNumberingAfterBreak="0">
+    <w:nsid w:val="1E6D0214"/>
+    <w:multiLevelType w:val="hybridMultilevel"/>
+    <w:tmpl w:val="73529768"/>
+    <w:lvl w:ilvl="0" w:tplc="1FC298B2">
+      <w:start w:val="1"/>
+      <w:numFmt w:val="decimal"/>
+      <w:lvlText w:val="%1."/>
+      <w:lvlJc w:val="left"/>
+      <w:pPr>
+        <w:ind w:left="360" w:hanging="360"/>
+      </w:pPr>
+      <w:rPr>
+        <w:rFonts w:hint="default"/>
+      </w:rPr>
+    </w:lvl>
+    <w:lvl w:ilvl="1" w:tplc="04090019" w:tentative="1">
+      <w:start w:val="1"/>
+      <w:numFmt w:val="ideographTraditional"/>
+      <w:lvlText w:val="%2、"/>
+      <w:lvlJc w:val="left"/>
+      <w:pPr>
+        <w:ind w:left="960" w:hanging="480"/>
+      </w:pPr>
+    </w:lvl>
+    <w:lvl w:ilvl="2" w:tplc="0409001B" w:tentative="1">
+      <w:start w:val="1"/>
+      <w:numFmt w:val="lowerRoman"/>
+      <w:lvlText w:val="%3."/>
+      <w:lvlJc w:val="right"/>
+      <w:pPr>
+        <w:ind w:left="1440" w:hanging="480"/>
+      </w:pPr>
+    </w:lvl>
+    <w:lvl w:ilvl="3" w:tplc="0409000F" w:tentative="1">
+      <w:start w:val="1"/>
+      <w:numFmt w:val="decimal"/>
+      <w:lvlText w:val="%4."/>
+      <w:lvlJc w:val="left"/>
+      <w:pPr>
+        <w:ind w:left="1920" w:hanging="480"/>
+      </w:pPr>
+    </w:lvl>
+    <w:lvl w:ilvl="4" w:tplc="04090019" w:tentative="1">
+      <w:start w:val="1"/>
+      <w:numFmt w:val="ideographTraditional"/>
+      <w:lvlText w:val="%5、"/>
+      <w:lvlJc w:val="left"/>
+      <w:pPr>
+        <w:ind w:left="2400" w:hanging="480"/>
+      </w:pPr>
+    </w:lvl>
+    <w:lvl w:ilvl="5" w:tplc="0409001B" w:tentative="1">
+      <w:start w:val="1"/>
+      <w:numFmt w:val="lowerRoman"/>
+      <w:lvlText w:val="%6."/>
+      <w:lvlJc w:val="right"/>
+      <w:pPr>
+        <w:ind w:left="2880" w:hanging="480"/>
+      </w:pPr>
+    </w:lvl>
+    <w:lvl w:ilvl="6" w:tplc="0409000F" w:tentative="1">
+      <w:start w:val="1"/>
+      <w:numFmt w:val="decimal"/>
+      <w:lvlText w:val="%7."/>
+      <w:lvlJc w:val="left"/>
+      <w:pPr>
+        <w:ind w:left="3360" w:hanging="480"/>
+      </w:pPr>
+    </w:lvl>
+    <w:lvl w:ilvl="7" w:tplc="04090019" w:tentative="1">
+      <w:start w:val="1"/>
+      <w:numFmt w:val="ideographTraditional"/>
+      <w:lvlText w:val="%8、"/>
+      <w:lvlJc w:val="left"/>
+      <w:pPr>
+        <w:ind w:left="3840" w:hanging="480"/>
+      </w:pPr>
+    </w:lvl>
+    <w:lvl w:ilvl="8" w:tplc="0409001B" w:tentative="1">
+      <w:start w:val="1"/>
+      <w:numFmt w:val="lowerRoman"/>
+      <w:lvlText w:val="%9."/>
+      <w:lvlJc w:val="right"/>
+      <w:pPr>
+        <w:ind w:left="4320" w:hanging="480"/>
+      </w:pPr>
+    </w:lvl>
+  </w:abstractNum>
+  <w:abstractNum w:abstractNumId="7" w15:restartNumberingAfterBreak="0">
     <w:nsid w:val="249C3AB5"/>
     <w:multiLevelType w:val="multilevel"/>
     <w:tmpl w:val="E0B62218"/>
@@ -5765,9 +6658,9 @@
       <w:lvlJc w:val="left"/>
       <w:pPr>
         <w:tabs>
-          <w:tab w:val="num" w:pos="720"/>
-        </w:tabs>
-        <w:ind w:left="720" w:hanging="360"/>
+          <w:tab w:val="num" w:pos="644"/>
+        </w:tabs>
+        <w:ind w:left="644" w:hanging="360"/>
       </w:pPr>
     </w:lvl>
     <w:lvl w:ilvl="1" w:tentative="1">
@@ -5777,9 +6670,9 @@
       <w:lvlJc w:val="left"/>
       <w:pPr>
         <w:tabs>
-          <w:tab w:val="num" w:pos="1440"/>
-        </w:tabs>
-        <w:ind w:left="1440" w:hanging="360"/>
+          <w:tab w:val="num" w:pos="1364"/>
+        </w:tabs>
+        <w:ind w:left="1364" w:hanging="360"/>
       </w:pPr>
     </w:lvl>
     <w:lvl w:ilvl="2" w:tentative="1">
@@ -5789,9 +6682,9 @@
       <w:lvlJc w:val="left"/>
       <w:pPr>
         <w:tabs>
-          <w:tab w:val="num" w:pos="2160"/>
-        </w:tabs>
-        <w:ind w:left="2160" w:hanging="360"/>
+          <w:tab w:val="num" w:pos="2084"/>
+        </w:tabs>
+        <w:ind w:left="2084" w:hanging="360"/>
       </w:pPr>
     </w:lvl>
     <w:lvl w:ilvl="3" w:tentative="1">
@@ -5801,9 +6694,9 @@
       <w:lvlJc w:val="left"/>
       <w:pPr>
         <w:tabs>
-          <w:tab w:val="num" w:pos="2880"/>
-        </w:tabs>
-        <w:ind w:left="2880" w:hanging="360"/>
+          <w:tab w:val="num" w:pos="2804"/>
+        </w:tabs>
+        <w:ind w:left="2804" w:hanging="360"/>
       </w:pPr>
     </w:lvl>
     <w:lvl w:ilvl="4" w:tentative="1">
@@ -5813,9 +6706,9 @@
       <w:lvlJc w:val="left"/>
       <w:pPr>
         <w:tabs>
-          <w:tab w:val="num" w:pos="3600"/>
-        </w:tabs>
-        <w:ind w:left="3600" w:hanging="360"/>
+          <w:tab w:val="num" w:pos="3524"/>
+        </w:tabs>
+        <w:ind w:left="3524" w:hanging="360"/>
       </w:pPr>
     </w:lvl>
     <w:lvl w:ilvl="5" w:tentative="1">
@@ -5825,9 +6718,9 @@
       <w:lvlJc w:val="left"/>
       <w:pPr>
         <w:tabs>
-          <w:tab w:val="num" w:pos="4320"/>
-        </w:tabs>
-        <w:ind w:left="4320" w:hanging="360"/>
+          <w:tab w:val="num" w:pos="4244"/>
+        </w:tabs>
+        <w:ind w:left="4244" w:hanging="360"/>
       </w:pPr>
     </w:lvl>
     <w:lvl w:ilvl="6" w:tentative="1">
@@ -5837,9 +6730,9 @@
       <w:lvlJc w:val="left"/>
       <w:pPr>
         <w:tabs>
-          <w:tab w:val="num" w:pos="5040"/>
-        </w:tabs>
-        <w:ind w:left="5040" w:hanging="360"/>
+          <w:tab w:val="num" w:pos="4964"/>
+        </w:tabs>
+        <w:ind w:left="4964" w:hanging="360"/>
       </w:pPr>
     </w:lvl>
     <w:lvl w:ilvl="7" w:tentative="1">
@@ -5849,9 +6742,9 @@
       <w:lvlJc w:val="left"/>
       <w:pPr>
         <w:tabs>
-          <w:tab w:val="num" w:pos="5760"/>
-        </w:tabs>
-        <w:ind w:left="5760" w:hanging="360"/>
+          <w:tab w:val="num" w:pos="5684"/>
+        </w:tabs>
+        <w:ind w:left="5684" w:hanging="360"/>
       </w:pPr>
     </w:lvl>
     <w:lvl w:ilvl="8" w:tentative="1">
@@ -5861,13 +6754,13 @@
       <w:lvlJc w:val="left"/>
       <w:pPr>
         <w:tabs>
-          <w:tab w:val="num" w:pos="6480"/>
-        </w:tabs>
-        <w:ind w:left="6480" w:hanging="360"/>
+          <w:tab w:val="num" w:pos="6404"/>
+        </w:tabs>
+        <w:ind w:left="6404" w:hanging="360"/>
       </w:pPr>
     </w:lvl>
   </w:abstractNum>
-  <w:abstractNum w:abstractNumId="6" w15:restartNumberingAfterBreak="0">
+  <w:abstractNum w:abstractNumId="8" w15:restartNumberingAfterBreak="0">
     <w:nsid w:val="267223F9"/>
     <w:multiLevelType w:val="hybridMultilevel"/>
     <w:tmpl w:val="7B84E6F4"/>
@@ -5953,7 +6846,7 @@
       </w:pPr>
     </w:lvl>
   </w:abstractNum>
-  <w:abstractNum w:abstractNumId="7" w15:restartNumberingAfterBreak="0">
+  <w:abstractNum w:abstractNumId="9" w15:restartNumberingAfterBreak="0">
     <w:nsid w:val="2E302043"/>
     <w:multiLevelType w:val="multilevel"/>
     <w:tmpl w:val="9E884AC6"/>
@@ -6102,7 +6995,7 @@
       </w:rPr>
     </w:lvl>
   </w:abstractNum>
-  <w:abstractNum w:abstractNumId="8" w15:restartNumberingAfterBreak="0">
+  <w:abstractNum w:abstractNumId="10" w15:restartNumberingAfterBreak="0">
     <w:nsid w:val="2ECF777E"/>
     <w:multiLevelType w:val="multilevel"/>
     <w:tmpl w:val="CB4808A0"/>
@@ -6215,7 +7108,96 @@
       </w:pPr>
     </w:lvl>
   </w:abstractNum>
-  <w:abstractNum w:abstractNumId="9" w15:restartNumberingAfterBreak="0">
+  <w:abstractNum w:abstractNumId="11" w15:restartNumberingAfterBreak="0">
+    <w:nsid w:val="3B5267CD"/>
+    <w:multiLevelType w:val="hybridMultilevel"/>
+    <w:tmpl w:val="F172211E"/>
+    <w:lvl w:ilvl="0" w:tplc="2A3808B8">
+      <w:start w:val="1"/>
+      <w:numFmt w:val="decimal"/>
+      <w:lvlText w:val="%1."/>
+      <w:lvlJc w:val="left"/>
+      <w:pPr>
+        <w:ind w:left="360" w:hanging="360"/>
+      </w:pPr>
+      <w:rPr>
+        <w:rFonts w:hint="default"/>
+      </w:rPr>
+    </w:lvl>
+    <w:lvl w:ilvl="1" w:tplc="04090019" w:tentative="1">
+      <w:start w:val="1"/>
+      <w:numFmt w:val="ideographTraditional"/>
+      <w:lvlText w:val="%2、"/>
+      <w:lvlJc w:val="left"/>
+      <w:pPr>
+        <w:ind w:left="960" w:hanging="480"/>
+      </w:pPr>
+    </w:lvl>
+    <w:lvl w:ilvl="2" w:tplc="0409001B" w:tentative="1">
+      <w:start w:val="1"/>
+      <w:numFmt w:val="lowerRoman"/>
+      <w:lvlText w:val="%3."/>
+      <w:lvlJc w:val="right"/>
+      <w:pPr>
+        <w:ind w:left="1440" w:hanging="480"/>
+      </w:pPr>
+    </w:lvl>
+    <w:lvl w:ilvl="3" w:tplc="0409000F" w:tentative="1">
+      <w:start w:val="1"/>
+      <w:numFmt w:val="decimal"/>
+      <w:lvlText w:val="%4."/>
+      <w:lvlJc w:val="left"/>
+      <w:pPr>
+        <w:ind w:left="1920" w:hanging="480"/>
+      </w:pPr>
+    </w:lvl>
+    <w:lvl w:ilvl="4" w:tplc="04090019" w:tentative="1">
+      <w:start w:val="1"/>
+      <w:numFmt w:val="ideographTraditional"/>
+      <w:lvlText w:val="%5、"/>
+      <w:lvlJc w:val="left"/>
+      <w:pPr>
+        <w:ind w:left="2400" w:hanging="480"/>
+      </w:pPr>
+    </w:lvl>
+    <w:lvl w:ilvl="5" w:tplc="0409001B" w:tentative="1">
+      <w:start w:val="1"/>
+      <w:numFmt w:val="lowerRoman"/>
+      <w:lvlText w:val="%6."/>
+      <w:lvlJc w:val="right"/>
+      <w:pPr>
+        <w:ind w:left="2880" w:hanging="480"/>
+      </w:pPr>
+    </w:lvl>
+    <w:lvl w:ilvl="6" w:tplc="0409000F" w:tentative="1">
+      <w:start w:val="1"/>
+      <w:numFmt w:val="decimal"/>
+      <w:lvlText w:val="%7."/>
+      <w:lvlJc w:val="left"/>
+      <w:pPr>
+        <w:ind w:left="3360" w:hanging="480"/>
+      </w:pPr>
+    </w:lvl>
+    <w:lvl w:ilvl="7" w:tplc="04090019" w:tentative="1">
+      <w:start w:val="1"/>
+      <w:numFmt w:val="ideographTraditional"/>
+      <w:lvlText w:val="%8、"/>
+      <w:lvlJc w:val="left"/>
+      <w:pPr>
+        <w:ind w:left="3840" w:hanging="480"/>
+      </w:pPr>
+    </w:lvl>
+    <w:lvl w:ilvl="8" w:tplc="0409001B" w:tentative="1">
+      <w:start w:val="1"/>
+      <w:numFmt w:val="lowerRoman"/>
+      <w:lvlText w:val="%9."/>
+      <w:lvlJc w:val="right"/>
+      <w:pPr>
+        <w:ind w:left="4320" w:hanging="480"/>
+      </w:pPr>
+    </w:lvl>
+  </w:abstractNum>
+  <w:abstractNum w:abstractNumId="12" w15:restartNumberingAfterBreak="0">
     <w:nsid w:val="4A892D1C"/>
     <w:multiLevelType w:val="hybridMultilevel"/>
     <w:tmpl w:val="6A081320"/>
@@ -6349,7 +7331,7 @@
       </w:rPr>
     </w:lvl>
   </w:abstractNum>
-  <w:abstractNum w:abstractNumId="10" w15:restartNumberingAfterBreak="0">
+  <w:abstractNum w:abstractNumId="13" w15:restartNumberingAfterBreak="0">
     <w:nsid w:val="4DD357A6"/>
     <w:multiLevelType w:val="multilevel"/>
     <w:tmpl w:val="707E0AF4"/>
@@ -6462,7 +7444,7 @@
       </w:pPr>
     </w:lvl>
   </w:abstractNum>
-  <w:abstractNum w:abstractNumId="11" w15:restartNumberingAfterBreak="0">
+  <w:abstractNum w:abstractNumId="14" w15:restartNumberingAfterBreak="0">
     <w:nsid w:val="4FA53F13"/>
     <w:multiLevelType w:val="multilevel"/>
     <w:tmpl w:val="143EEEE0"/>
@@ -6575,7 +7557,7 @@
       </w:pPr>
     </w:lvl>
   </w:abstractNum>
-  <w:abstractNum w:abstractNumId="12" w15:restartNumberingAfterBreak="0">
+  <w:abstractNum w:abstractNumId="15" w15:restartNumberingAfterBreak="0">
     <w:nsid w:val="50686C5F"/>
     <w:multiLevelType w:val="multilevel"/>
     <w:tmpl w:val="9F2C0B54"/>
@@ -6688,7 +7670,7 @@
       </w:pPr>
     </w:lvl>
   </w:abstractNum>
-  <w:abstractNum w:abstractNumId="13" w15:restartNumberingAfterBreak="0">
+  <w:abstractNum w:abstractNumId="16" w15:restartNumberingAfterBreak="0">
     <w:nsid w:val="510B6AF3"/>
     <w:multiLevelType w:val="hybridMultilevel"/>
     <w:tmpl w:val="6B0E57B6"/>
@@ -6828,7 +7810,7 @@
       </w:rPr>
     </w:lvl>
   </w:abstractNum>
-  <w:abstractNum w:abstractNumId="14" w15:restartNumberingAfterBreak="0">
+  <w:abstractNum w:abstractNumId="17" w15:restartNumberingAfterBreak="0">
     <w:nsid w:val="576A4380"/>
     <w:multiLevelType w:val="hybridMultilevel"/>
     <w:tmpl w:val="7F86CB26"/>
@@ -6914,7 +7896,7 @@
       </w:pPr>
     </w:lvl>
   </w:abstractNum>
-  <w:abstractNum w:abstractNumId="15" w15:restartNumberingAfterBreak="0">
+  <w:abstractNum w:abstractNumId="18" w15:restartNumberingAfterBreak="0">
     <w:nsid w:val="600745AA"/>
     <w:multiLevelType w:val="hybridMultilevel"/>
     <w:tmpl w:val="7BCE176C"/>
@@ -7054,7 +8036,7 @@
       </w:rPr>
     </w:lvl>
   </w:abstractNum>
-  <w:abstractNum w:abstractNumId="16" w15:restartNumberingAfterBreak="0">
+  <w:abstractNum w:abstractNumId="19" w15:restartNumberingAfterBreak="0">
     <w:nsid w:val="63660093"/>
     <w:multiLevelType w:val="multilevel"/>
     <w:tmpl w:val="487AC5E8"/>
@@ -7167,7 +8149,7 @@
       </w:pPr>
     </w:lvl>
   </w:abstractNum>
-  <w:abstractNum w:abstractNumId="17" w15:restartNumberingAfterBreak="0">
+  <w:abstractNum w:abstractNumId="20" w15:restartNumberingAfterBreak="0">
     <w:nsid w:val="66633041"/>
     <w:multiLevelType w:val="hybridMultilevel"/>
     <w:tmpl w:val="F3BAEAD8"/>
@@ -7307,7 +8289,7 @@
       </w:rPr>
     </w:lvl>
   </w:abstractNum>
-  <w:abstractNum w:abstractNumId="18" w15:restartNumberingAfterBreak="0">
+  <w:abstractNum w:abstractNumId="21" w15:restartNumberingAfterBreak="0">
     <w:nsid w:val="67445AD2"/>
     <w:multiLevelType w:val="hybridMultilevel"/>
     <w:tmpl w:val="C4DE3054"/>
@@ -7447,7 +8429,7 @@
       </w:rPr>
     </w:lvl>
   </w:abstractNum>
-  <w:abstractNum w:abstractNumId="19" w15:restartNumberingAfterBreak="0">
+  <w:abstractNum w:abstractNumId="22" w15:restartNumberingAfterBreak="0">
     <w:nsid w:val="6E5869E4"/>
     <w:multiLevelType w:val="multilevel"/>
     <w:tmpl w:val="22AC937C"/>
@@ -7560,7 +8542,7 @@
       </w:pPr>
     </w:lvl>
   </w:abstractNum>
-  <w:abstractNum w:abstractNumId="20" w15:restartNumberingAfterBreak="0">
+  <w:abstractNum w:abstractNumId="23" w15:restartNumberingAfterBreak="0">
     <w:nsid w:val="6F90345B"/>
     <w:multiLevelType w:val="multilevel"/>
     <w:tmpl w:val="76CCD152"/>
@@ -7673,7 +8655,96 @@
       </w:pPr>
     </w:lvl>
   </w:abstractNum>
-  <w:abstractNum w:abstractNumId="21" w15:restartNumberingAfterBreak="0">
+  <w:abstractNum w:abstractNumId="24" w15:restartNumberingAfterBreak="0">
+    <w:nsid w:val="72F85EB2"/>
+    <w:multiLevelType w:val="hybridMultilevel"/>
+    <w:tmpl w:val="184694C4"/>
+    <w:lvl w:ilvl="0" w:tplc="3D7870D4">
+      <w:start w:val="1"/>
+      <w:numFmt w:val="decimal"/>
+      <w:lvlText w:val="%1."/>
+      <w:lvlJc w:val="left"/>
+      <w:pPr>
+        <w:ind w:left="360" w:hanging="360"/>
+      </w:pPr>
+      <w:rPr>
+        <w:rFonts w:hint="default"/>
+      </w:rPr>
+    </w:lvl>
+    <w:lvl w:ilvl="1" w:tplc="04090019" w:tentative="1">
+      <w:start w:val="1"/>
+      <w:numFmt w:val="ideographTraditional"/>
+      <w:lvlText w:val="%2、"/>
+      <w:lvlJc w:val="left"/>
+      <w:pPr>
+        <w:ind w:left="960" w:hanging="480"/>
+      </w:pPr>
+    </w:lvl>
+    <w:lvl w:ilvl="2" w:tplc="0409001B" w:tentative="1">
+      <w:start w:val="1"/>
+      <w:numFmt w:val="lowerRoman"/>
+      <w:lvlText w:val="%3."/>
+      <w:lvlJc w:val="right"/>
+      <w:pPr>
+        <w:ind w:left="1440" w:hanging="480"/>
+      </w:pPr>
+    </w:lvl>
+    <w:lvl w:ilvl="3" w:tplc="0409000F" w:tentative="1">
+      <w:start w:val="1"/>
+      <w:numFmt w:val="decimal"/>
+      <w:lvlText w:val="%4."/>
+      <w:lvlJc w:val="left"/>
+      <w:pPr>
+        <w:ind w:left="1920" w:hanging="480"/>
+      </w:pPr>
+    </w:lvl>
+    <w:lvl w:ilvl="4" w:tplc="04090019" w:tentative="1">
+      <w:start w:val="1"/>
+      <w:numFmt w:val="ideographTraditional"/>
+      <w:lvlText w:val="%5、"/>
+      <w:lvlJc w:val="left"/>
+      <w:pPr>
+        <w:ind w:left="2400" w:hanging="480"/>
+      </w:pPr>
+    </w:lvl>
+    <w:lvl w:ilvl="5" w:tplc="0409001B" w:tentative="1">
+      <w:start w:val="1"/>
+      <w:numFmt w:val="lowerRoman"/>
+      <w:lvlText w:val="%6."/>
+      <w:lvlJc w:val="right"/>
+      <w:pPr>
+        <w:ind w:left="2880" w:hanging="480"/>
+      </w:pPr>
+    </w:lvl>
+    <w:lvl w:ilvl="6" w:tplc="0409000F" w:tentative="1">
+      <w:start w:val="1"/>
+      <w:numFmt w:val="decimal"/>
+      <w:lvlText w:val="%7."/>
+      <w:lvlJc w:val="left"/>
+      <w:pPr>
+        <w:ind w:left="3360" w:hanging="480"/>
+      </w:pPr>
+    </w:lvl>
+    <w:lvl w:ilvl="7" w:tplc="04090019" w:tentative="1">
+      <w:start w:val="1"/>
+      <w:numFmt w:val="ideographTraditional"/>
+      <w:lvlText w:val="%8、"/>
+      <w:lvlJc w:val="left"/>
+      <w:pPr>
+        <w:ind w:left="3840" w:hanging="480"/>
+      </w:pPr>
+    </w:lvl>
+    <w:lvl w:ilvl="8" w:tplc="0409001B" w:tentative="1">
+      <w:start w:val="1"/>
+      <w:numFmt w:val="lowerRoman"/>
+      <w:lvlText w:val="%9."/>
+      <w:lvlJc w:val="right"/>
+      <w:pPr>
+        <w:ind w:left="4320" w:hanging="480"/>
+      </w:pPr>
+    </w:lvl>
+  </w:abstractNum>
+  <w:abstractNum w:abstractNumId="25" w15:restartNumberingAfterBreak="0">
     <w:nsid w:val="745C3AEA"/>
     <w:multiLevelType w:val="hybridMultilevel"/>
     <w:tmpl w:val="AB2AF8BA"/>
@@ -7786,7 +8857,7 @@
       </w:rPr>
     </w:lvl>
   </w:abstractNum>
-  <w:abstractNum w:abstractNumId="22" w15:restartNumberingAfterBreak="0">
+  <w:abstractNum w:abstractNumId="26" w15:restartNumberingAfterBreak="0">
     <w:nsid w:val="755D4AD5"/>
     <w:multiLevelType w:val="multilevel"/>
     <w:tmpl w:val="1AF6A79A"/>
@@ -7935,7 +9006,7 @@
       </w:rPr>
     </w:lvl>
   </w:abstractNum>
-  <w:abstractNum w:abstractNumId="23" w15:restartNumberingAfterBreak="0">
+  <w:abstractNum w:abstractNumId="27" w15:restartNumberingAfterBreak="0">
     <w:nsid w:val="7D601873"/>
     <w:multiLevelType w:val="multilevel"/>
     <w:tmpl w:val="6660EE9E"/>
@@ -8085,82 +9156,94 @@
     </w:lvl>
   </w:abstractNum>
   <w:num w:numId="1" w16cid:durableId="178129358">
-    <w:abstractNumId w:val="7"/>
+    <w:abstractNumId w:val="9"/>
   </w:num>
   <w:num w:numId="2" w16cid:durableId="184292703">
-    <w:abstractNumId w:val="12"/>
+    <w:abstractNumId w:val="15"/>
   </w:num>
   <w:num w:numId="3" w16cid:durableId="1575118697">
     <w:abstractNumId w:val="0"/>
   </w:num>
   <w:num w:numId="4" w16cid:durableId="731463887">
-    <w:abstractNumId w:val="22"/>
+    <w:abstractNumId w:val="26"/>
   </w:num>
   <w:num w:numId="5" w16cid:durableId="619185889">
     <w:abstractNumId w:val="2"/>
   </w:num>
   <w:num w:numId="6" w16cid:durableId="1071270425">
-    <w:abstractNumId w:val="5"/>
+    <w:abstractNumId w:val="7"/>
   </w:num>
   <w:num w:numId="7" w16cid:durableId="1588727719">
-    <w:abstractNumId w:val="20"/>
+    <w:abstractNumId w:val="23"/>
   </w:num>
   <w:num w:numId="8" w16cid:durableId="533738981">
-    <w:abstractNumId w:val="8"/>
+    <w:abstractNumId w:val="10"/>
   </w:num>
   <w:num w:numId="9" w16cid:durableId="1269434050">
+    <w:abstractNumId w:val="22"/>
+  </w:num>
+  <w:num w:numId="10" w16cid:durableId="1732079054">
     <w:abstractNumId w:val="19"/>
   </w:num>
-  <w:num w:numId="10" w16cid:durableId="1732079054">
+  <w:num w:numId="11" w16cid:durableId="1035348155">
+    <w:abstractNumId w:val="13"/>
+  </w:num>
+  <w:num w:numId="12" w16cid:durableId="1142964469">
+    <w:abstractNumId w:val="14"/>
+  </w:num>
+  <w:num w:numId="13" w16cid:durableId="1675378421">
+    <w:abstractNumId w:val="27"/>
+  </w:num>
+  <w:num w:numId="14" w16cid:durableId="815490794">
+    <w:abstractNumId w:val="25"/>
+  </w:num>
+  <w:num w:numId="15" w16cid:durableId="1567035629">
+    <w:abstractNumId w:val="4"/>
+  </w:num>
+  <w:num w:numId="16" w16cid:durableId="1944191802">
     <w:abstractNumId w:val="16"/>
   </w:num>
-  <w:num w:numId="11" w16cid:durableId="1035348155">
-    <w:abstractNumId w:val="10"/>
+  <w:num w:numId="17" w16cid:durableId="467089125">
+    <w:abstractNumId w:val="18"/>
   </w:num>
-  <w:num w:numId="12" w16cid:durableId="1142964469">
-    <w:abstractNumId w:val="11"/>
-  </w:num>
-  <w:num w:numId="13" w16cid:durableId="1675378421">
-    <w:abstractNumId w:val="23"/>
-  </w:num>
-  <w:num w:numId="14" w16cid:durableId="815490794">
+  <w:num w:numId="18" w16cid:durableId="771702364">
     <w:abstractNumId w:val="21"/>
   </w:num>
-  <w:num w:numId="15" w16cid:durableId="1567035629">
-    <w:abstractNumId w:val="3"/>
-  </w:num>
-  <w:num w:numId="16" w16cid:durableId="1944191802">
-    <w:abstractNumId w:val="13"/>
-  </w:num>
-  <w:num w:numId="17" w16cid:durableId="467089125">
-    <w:abstractNumId w:val="15"/>
-  </w:num>
-  <w:num w:numId="18" w16cid:durableId="771702364">
-    <w:abstractNumId w:val="18"/>
-  </w:num>
   <w:num w:numId="19" w16cid:durableId="893585597">
-    <w:abstractNumId w:val="9"/>
+    <w:abstractNumId w:val="12"/>
   </w:num>
   <w:num w:numId="20" w16cid:durableId="5520643">
-    <w:abstractNumId w:val="14"/>
+    <w:abstractNumId w:val="17"/>
   </w:num>
   <w:num w:numId="21" w16cid:durableId="1673995430">
-    <w:abstractNumId w:val="4"/>
+    <w:abstractNumId w:val="5"/>
   </w:num>
   <w:num w:numId="22" w16cid:durableId="1335179808">
     <w:abstractNumId w:val="1"/>
   </w:num>
   <w:num w:numId="23" w16cid:durableId="347214929">
+    <w:abstractNumId w:val="8"/>
+  </w:num>
+  <w:num w:numId="24" w16cid:durableId="1413353911">
+    <w:abstractNumId w:val="20"/>
+  </w:num>
+  <w:num w:numId="25" w16cid:durableId="1934436998">
+    <w:abstractNumId w:val="24"/>
+  </w:num>
+  <w:num w:numId="26" w16cid:durableId="987783054">
     <w:abstractNumId w:val="6"/>
   </w:num>
-  <w:num w:numId="24" w16cid:durableId="1413353911">
-    <w:abstractNumId w:val="17"/>
+  <w:num w:numId="27" w16cid:durableId="815955619">
+    <w:abstractNumId w:val="11"/>
+  </w:num>
+  <w:num w:numId="28" w16cid:durableId="1714033524">
+    <w:abstractNumId w:val="3"/>
   </w:num>
 </w:numbering>
 </file>
 
 <file path=word/styles.xml><?xml version="1.0" encoding="utf-8"?>
-<w:styles xmlns:mc="http://schemas.openxmlformats.org/markup-compatibility/2006" xmlns:r="http://schemas.openxmlformats.org/officeDocument/2006/relationships" xmlns:w="http://schemas.openxmlformats.org/wordprocessingml/2006/main" xmlns:w14="http://schemas.microsoft.com/office/word/2010/wordml" xmlns:w15="http://schemas.microsoft.com/office/word/2012/wordml" xmlns:w16cex="http://schemas.microsoft.com/office/word/2018/wordml/cex" xmlns:w16cid="http://schemas.microsoft.com/office/word/2016/wordml/cid" xmlns:w16="http://schemas.microsoft.com/office/word/2018/wordml" xmlns:w16du="http://schemas.microsoft.com/office/word/2023/wordml/word16du" xmlns:w16sdtdh="http://schemas.microsoft.com/office/word/2020/wordml/sdtdatahash" xmlns:w16sdtfl="http://schemas.microsoft.com/office/word/2024/wordml/sdtformatlock" xmlns:w16se="http://schemas.microsoft.com/office/word/2015/wordml/symex" mc:Ignorable="w14 w15 w16se w16cid w16 w16cex w16sdtdh w16sdtfl w16du">
+<w:styles xmlns:mc="http://schemas.openxmlformats.org/markup-compatibility/2006" xmlns:r="http://schemas.openxmlformats.org/officeDocument/2006/relationships" xmlns:w="http://schemas.openxmlformats.org/wordprocessingml/2006/main" xmlns:w14="http://schemas.microsoft.com/office/word/2010/wordml" xmlns:w15="http://schemas.microsoft.com/office/word/2012/wordml" xmlns:w16cex="http://schemas.microsoft.com/office/word/2018/wordml/cex" xmlns:w16cid="http://schemas.microsoft.com/office/word/2016/wordml/cid" xmlns:w16="http://schemas.microsoft.com/office/word/2018/wordml" xmlns:w16sdtdh="http://schemas.microsoft.com/office/word/2020/wordml/sdtdatahash" xmlns:w16se="http://schemas.microsoft.com/office/word/2015/wordml/symex" mc:Ignorable="w14 w15 w16se w16cid w16 w16cex w16sdtdh">
   <w:docDefaults>
     <w:rPrDefault>
       <w:rPr>
@@ -8556,15 +9639,15 @@
     <w:lsdException w:name="Unresolved Mention" w:semiHidden="1" w:unhideWhenUsed="1"/>
     <w:lsdException w:name="Smart Link" w:semiHidden="1" w:unhideWhenUsed="1"/>
   </w:latentStyles>
-  <w:style w:type="paragraph" w:default="1" w:styleId="Normal">
+  <w:style w:type="paragraph" w:default="1" w:styleId="a">
     <w:name w:val="Normal"/>
     <w:qFormat/>
   </w:style>
-  <w:style w:type="paragraph" w:styleId="Heading1">
+  <w:style w:type="paragraph" w:styleId="1">
     <w:name w:val="heading 1"/>
-    <w:basedOn w:val="Normal"/>
-    <w:next w:val="Normal"/>
-    <w:link w:val="Heading1Char"/>
+    <w:basedOn w:val="a"/>
+    <w:next w:val="a"/>
+    <w:link w:val="10"/>
     <w:uiPriority w:val="9"/>
     <w:qFormat/>
     <w:rsid w:val="0018685D"/>
@@ -8581,11 +9664,11 @@
       <w:szCs w:val="40"/>
     </w:rPr>
   </w:style>
-  <w:style w:type="paragraph" w:styleId="Heading2">
+  <w:style w:type="paragraph" w:styleId="2">
     <w:name w:val="heading 2"/>
-    <w:basedOn w:val="Normal"/>
-    <w:next w:val="Normal"/>
-    <w:link w:val="Heading2Char"/>
+    <w:basedOn w:val="a"/>
+    <w:next w:val="a"/>
+    <w:link w:val="20"/>
     <w:uiPriority w:val="9"/>
     <w:semiHidden/>
     <w:unhideWhenUsed/>
@@ -8604,11 +9687,11 @@
       <w:szCs w:val="32"/>
     </w:rPr>
   </w:style>
-  <w:style w:type="paragraph" w:styleId="Heading3">
+  <w:style w:type="paragraph" w:styleId="3">
     <w:name w:val="heading 3"/>
-    <w:basedOn w:val="Normal"/>
-    <w:next w:val="Normal"/>
-    <w:link w:val="Heading3Char"/>
+    <w:basedOn w:val="a"/>
+    <w:next w:val="a"/>
+    <w:link w:val="30"/>
     <w:uiPriority w:val="9"/>
     <w:semiHidden/>
     <w:unhideWhenUsed/>
@@ -8627,11 +9710,11 @@
       <w:szCs w:val="28"/>
     </w:rPr>
   </w:style>
-  <w:style w:type="paragraph" w:styleId="Heading4">
+  <w:style w:type="paragraph" w:styleId="4">
     <w:name w:val="heading 4"/>
-    <w:basedOn w:val="Normal"/>
-    <w:next w:val="Normal"/>
-    <w:link w:val="Heading4Char"/>
+    <w:basedOn w:val="a"/>
+    <w:next w:val="a"/>
+    <w:link w:val="40"/>
     <w:uiPriority w:val="9"/>
     <w:semiHidden/>
     <w:unhideWhenUsed/>
@@ -8650,11 +9733,11 @@
       <w:color w:val="0F4761" w:themeColor="accent1" w:themeShade="BF"/>
     </w:rPr>
   </w:style>
-  <w:style w:type="paragraph" w:styleId="Heading5">
+  <w:style w:type="paragraph" w:styleId="5">
     <w:name w:val="heading 5"/>
-    <w:basedOn w:val="Normal"/>
-    <w:next w:val="Normal"/>
-    <w:link w:val="Heading5Char"/>
+    <w:basedOn w:val="a"/>
+    <w:next w:val="a"/>
+    <w:link w:val="50"/>
     <w:uiPriority w:val="9"/>
     <w:semiHidden/>
     <w:unhideWhenUsed/>
@@ -8671,11 +9754,11 @@
       <w:color w:val="0F4761" w:themeColor="accent1" w:themeShade="BF"/>
     </w:rPr>
   </w:style>
-  <w:style w:type="paragraph" w:styleId="Heading6">
+  <w:style w:type="paragraph" w:styleId="6">
     <w:name w:val="heading 6"/>
-    <w:basedOn w:val="Normal"/>
-    <w:next w:val="Normal"/>
-    <w:link w:val="Heading6Char"/>
+    <w:basedOn w:val="a"/>
+    <w:next w:val="a"/>
+    <w:link w:val="60"/>
     <w:uiPriority w:val="9"/>
     <w:semiHidden/>
     <w:unhideWhenUsed/>
@@ -8694,11 +9777,11 @@
       <w:color w:val="595959" w:themeColor="text1" w:themeTint="A6"/>
     </w:rPr>
   </w:style>
-  <w:style w:type="paragraph" w:styleId="Heading7">
+  <w:style w:type="paragraph" w:styleId="7">
     <w:name w:val="heading 7"/>
-    <w:basedOn w:val="Normal"/>
-    <w:next w:val="Normal"/>
-    <w:link w:val="Heading7Char"/>
+    <w:basedOn w:val="a"/>
+    <w:next w:val="a"/>
+    <w:link w:val="70"/>
     <w:uiPriority w:val="9"/>
     <w:semiHidden/>
     <w:unhideWhenUsed/>
@@ -8715,11 +9798,11 @@
       <w:color w:val="595959" w:themeColor="text1" w:themeTint="A6"/>
     </w:rPr>
   </w:style>
-  <w:style w:type="paragraph" w:styleId="Heading8">
+  <w:style w:type="paragraph" w:styleId="8">
     <w:name w:val="heading 8"/>
-    <w:basedOn w:val="Normal"/>
-    <w:next w:val="Normal"/>
-    <w:link w:val="Heading8Char"/>
+    <w:basedOn w:val="a"/>
+    <w:next w:val="a"/>
+    <w:link w:val="80"/>
     <w:uiPriority w:val="9"/>
     <w:semiHidden/>
     <w:unhideWhenUsed/>
@@ -8738,11 +9821,11 @@
       <w:color w:val="272727" w:themeColor="text1" w:themeTint="D8"/>
     </w:rPr>
   </w:style>
-  <w:style w:type="paragraph" w:styleId="Heading9">
+  <w:style w:type="paragraph" w:styleId="9">
     <w:name w:val="heading 9"/>
-    <w:basedOn w:val="Normal"/>
-    <w:next w:val="Normal"/>
-    <w:link w:val="Heading9Char"/>
+    <w:basedOn w:val="a"/>
+    <w:next w:val="a"/>
+    <w:link w:val="90"/>
     <w:uiPriority w:val="9"/>
     <w:semiHidden/>
     <w:unhideWhenUsed/>
@@ -8759,12 +9842,12 @@
       <w:color w:val="272727" w:themeColor="text1" w:themeTint="D8"/>
     </w:rPr>
   </w:style>
-  <w:style w:type="character" w:default="1" w:styleId="DefaultParagraphFont">
+  <w:style w:type="character" w:default="1" w:styleId="a0">
     <w:name w:val="Default Paragraph Font"/>
     <w:uiPriority w:val="1"/>
     <w:unhideWhenUsed/>
   </w:style>
-  <w:style w:type="table" w:default="1" w:styleId="TableNormal">
+  <w:style w:type="table" w:default="1" w:styleId="a1">
     <w:name w:val="Normal Table"/>
     <w:uiPriority w:val="99"/>
     <w:semiHidden/>
@@ -8779,16 +9862,16 @@
       </w:tblCellMar>
     </w:tblPr>
   </w:style>
-  <w:style w:type="numbering" w:default="1" w:styleId="NoList">
+  <w:style w:type="numbering" w:default="1" w:styleId="a2">
     <w:name w:val="No List"/>
     <w:uiPriority w:val="99"/>
     <w:semiHidden/>
     <w:unhideWhenUsed/>
   </w:style>
-  <w:style w:type="character" w:customStyle="1" w:styleId="Heading1Char">
-    <w:name w:val="Heading 1 Char"/>
-    <w:basedOn w:val="DefaultParagraphFont"/>
-    <w:link w:val="Heading1"/>
+  <w:style w:type="character" w:customStyle="1" w:styleId="10">
+    <w:name w:val="標題 1 字元"/>
+    <w:basedOn w:val="a0"/>
+    <w:link w:val="1"/>
     <w:uiPriority w:val="9"/>
     <w:rsid w:val="0018685D"/>
     <w:rPr>
@@ -8798,10 +9881,10 @@
       <w:szCs w:val="40"/>
     </w:rPr>
   </w:style>
-  <w:style w:type="character" w:customStyle="1" w:styleId="Heading2Char">
-    <w:name w:val="Heading 2 Char"/>
-    <w:basedOn w:val="DefaultParagraphFont"/>
-    <w:link w:val="Heading2"/>
+  <w:style w:type="character" w:customStyle="1" w:styleId="20">
+    <w:name w:val="標題 2 字元"/>
+    <w:basedOn w:val="a0"/>
+    <w:link w:val="2"/>
     <w:uiPriority w:val="9"/>
     <w:semiHidden/>
     <w:rsid w:val="0018685D"/>
@@ -8812,10 +9895,10 @@
       <w:szCs w:val="32"/>
     </w:rPr>
   </w:style>
-  <w:style w:type="character" w:customStyle="1" w:styleId="Heading3Char">
-    <w:name w:val="Heading 3 Char"/>
-    <w:basedOn w:val="DefaultParagraphFont"/>
-    <w:link w:val="Heading3"/>
+  <w:style w:type="character" w:customStyle="1" w:styleId="30">
+    <w:name w:val="標題 3 字元"/>
+    <w:basedOn w:val="a0"/>
+    <w:link w:val="3"/>
     <w:uiPriority w:val="9"/>
     <w:semiHidden/>
     <w:rsid w:val="0018685D"/>
@@ -8826,10 +9909,10 @@
       <w:szCs w:val="28"/>
     </w:rPr>
   </w:style>
-  <w:style w:type="character" w:customStyle="1" w:styleId="Heading4Char">
-    <w:name w:val="Heading 4 Char"/>
-    <w:basedOn w:val="DefaultParagraphFont"/>
-    <w:link w:val="Heading4"/>
+  <w:style w:type="character" w:customStyle="1" w:styleId="40">
+    <w:name w:val="標題 4 字元"/>
+    <w:basedOn w:val="a0"/>
+    <w:link w:val="4"/>
     <w:uiPriority w:val="9"/>
     <w:semiHidden/>
     <w:rsid w:val="0018685D"/>
@@ -8840,10 +9923,10 @@
       <w:color w:val="0F4761" w:themeColor="accent1" w:themeShade="BF"/>
     </w:rPr>
   </w:style>
-  <w:style w:type="character" w:customStyle="1" w:styleId="Heading5Char">
-    <w:name w:val="Heading 5 Char"/>
-    <w:basedOn w:val="DefaultParagraphFont"/>
-    <w:link w:val="Heading5"/>
+  <w:style w:type="character" w:customStyle="1" w:styleId="50">
+    <w:name w:val="標題 5 字元"/>
+    <w:basedOn w:val="a0"/>
+    <w:link w:val="5"/>
     <w:uiPriority w:val="9"/>
     <w:semiHidden/>
     <w:rsid w:val="0018685D"/>
@@ -8852,10 +9935,10 @@
       <w:color w:val="0F4761" w:themeColor="accent1" w:themeShade="BF"/>
     </w:rPr>
   </w:style>
-  <w:style w:type="character" w:customStyle="1" w:styleId="Heading6Char">
-    <w:name w:val="Heading 6 Char"/>
-    <w:basedOn w:val="DefaultParagraphFont"/>
-    <w:link w:val="Heading6"/>
+  <w:style w:type="character" w:customStyle="1" w:styleId="60">
+    <w:name w:val="標題 6 字元"/>
+    <w:basedOn w:val="a0"/>
+    <w:link w:val="6"/>
     <w:uiPriority w:val="9"/>
     <w:semiHidden/>
     <w:rsid w:val="0018685D"/>
@@ -8866,10 +9949,10 @@
       <w:color w:val="595959" w:themeColor="text1" w:themeTint="A6"/>
     </w:rPr>
   </w:style>
-  <w:style w:type="character" w:customStyle="1" w:styleId="Heading7Char">
-    <w:name w:val="Heading 7 Char"/>
-    <w:basedOn w:val="DefaultParagraphFont"/>
-    <w:link w:val="Heading7"/>
+  <w:style w:type="character" w:customStyle="1" w:styleId="70">
+    <w:name w:val="標題 7 字元"/>
+    <w:basedOn w:val="a0"/>
+    <w:link w:val="7"/>
     <w:uiPriority w:val="9"/>
     <w:semiHidden/>
     <w:rsid w:val="0018685D"/>
@@ -8878,10 +9961,10 @@
       <w:color w:val="595959" w:themeColor="text1" w:themeTint="A6"/>
     </w:rPr>
   </w:style>
-  <w:style w:type="character" w:customStyle="1" w:styleId="Heading8Char">
-    <w:name w:val="Heading 8 Char"/>
-    <w:basedOn w:val="DefaultParagraphFont"/>
-    <w:link w:val="Heading8"/>
+  <w:style w:type="character" w:customStyle="1" w:styleId="80">
+    <w:name w:val="標題 8 字元"/>
+    <w:basedOn w:val="a0"/>
+    <w:link w:val="8"/>
     <w:uiPriority w:val="9"/>
     <w:semiHidden/>
     <w:rsid w:val="0018685D"/>
@@ -8892,10 +9975,10 @@
       <w:color w:val="272727" w:themeColor="text1" w:themeTint="D8"/>
     </w:rPr>
   </w:style>
-  <w:style w:type="character" w:customStyle="1" w:styleId="Heading9Char">
-    <w:name w:val="Heading 9 Char"/>
-    <w:basedOn w:val="DefaultParagraphFont"/>
-    <w:link w:val="Heading9"/>
+  <w:style w:type="character" w:customStyle="1" w:styleId="90">
+    <w:name w:val="標題 9 字元"/>
+    <w:basedOn w:val="a0"/>
+    <w:link w:val="9"/>
     <w:uiPriority w:val="9"/>
     <w:semiHidden/>
     <w:rsid w:val="0018685D"/>
@@ -8904,11 +9987,11 @@
       <w:color w:val="272727" w:themeColor="text1" w:themeTint="D8"/>
     </w:rPr>
   </w:style>
-  <w:style w:type="paragraph" w:styleId="Title">
+  <w:style w:type="paragraph" w:styleId="a3">
     <w:name w:val="Title"/>
-    <w:basedOn w:val="Normal"/>
-    <w:next w:val="Normal"/>
-    <w:link w:val="TitleChar"/>
+    <w:basedOn w:val="a"/>
+    <w:next w:val="a"/>
+    <w:link w:val="a4"/>
     <w:uiPriority w:val="10"/>
     <w:qFormat/>
     <w:rsid w:val="0018685D"/>
@@ -8924,10 +10007,10 @@
       <w:szCs w:val="56"/>
     </w:rPr>
   </w:style>
-  <w:style w:type="character" w:customStyle="1" w:styleId="TitleChar">
-    <w:name w:val="Title Char"/>
-    <w:basedOn w:val="DefaultParagraphFont"/>
-    <w:link w:val="Title"/>
+  <w:style w:type="character" w:customStyle="1" w:styleId="a4">
+    <w:name w:val="標題 字元"/>
+    <w:basedOn w:val="a0"/>
+    <w:link w:val="a3"/>
     <w:uiPriority w:val="10"/>
     <w:rsid w:val="0018685D"/>
     <w:rPr>
@@ -8938,11 +10021,11 @@
       <w:szCs w:val="56"/>
     </w:rPr>
   </w:style>
-  <w:style w:type="paragraph" w:styleId="Subtitle">
+  <w:style w:type="paragraph" w:styleId="a5">
     <w:name w:val="Subtitle"/>
-    <w:basedOn w:val="Normal"/>
-    <w:next w:val="Normal"/>
-    <w:link w:val="SubtitleChar"/>
+    <w:basedOn w:val="a"/>
+    <w:next w:val="a"/>
+    <w:link w:val="a6"/>
     <w:uiPriority w:val="11"/>
     <w:qFormat/>
     <w:rsid w:val="0018685D"/>
@@ -8959,10 +10042,10 @@
       <w:szCs w:val="28"/>
     </w:rPr>
   </w:style>
-  <w:style w:type="character" w:customStyle="1" w:styleId="SubtitleChar">
-    <w:name w:val="Subtitle Char"/>
-    <w:basedOn w:val="DefaultParagraphFont"/>
-    <w:link w:val="Subtitle"/>
+  <w:style w:type="character" w:customStyle="1" w:styleId="a6">
+    <w:name w:val="副標題 字元"/>
+    <w:basedOn w:val="a0"/>
+    <w:link w:val="a5"/>
     <w:uiPriority w:val="11"/>
     <w:rsid w:val="0018685D"/>
     <w:rPr>
@@ -8973,11 +10056,11 @@
       <w:szCs w:val="28"/>
     </w:rPr>
   </w:style>
-  <w:style w:type="paragraph" w:styleId="Quote">
+  <w:style w:type="paragraph" w:styleId="a7">
     <w:name w:val="Quote"/>
-    <w:basedOn w:val="Normal"/>
-    <w:next w:val="Normal"/>
-    <w:link w:val="QuoteChar"/>
+    <w:basedOn w:val="a"/>
+    <w:next w:val="a"/>
+    <w:link w:val="a8"/>
     <w:uiPriority w:val="29"/>
     <w:qFormat/>
     <w:rsid w:val="0018685D"/>
@@ -8991,10 +10074,10 @@
       <w:color w:val="404040" w:themeColor="text1" w:themeTint="BF"/>
     </w:rPr>
   </w:style>
-  <w:style w:type="character" w:customStyle="1" w:styleId="QuoteChar">
-    <w:name w:val="Quote Char"/>
-    <w:basedOn w:val="DefaultParagraphFont"/>
-    <w:link w:val="Quote"/>
+  <w:style w:type="character" w:customStyle="1" w:styleId="a8">
+    <w:name w:val="引文 字元"/>
+    <w:basedOn w:val="a0"/>
+    <w:link w:val="a7"/>
     <w:uiPriority w:val="29"/>
     <w:rsid w:val="0018685D"/>
     <w:rPr>
@@ -9003,9 +10086,9 @@
       <w:color w:val="404040" w:themeColor="text1" w:themeTint="BF"/>
     </w:rPr>
   </w:style>
-  <w:style w:type="paragraph" w:styleId="ListParagraph">
+  <w:style w:type="paragraph" w:styleId="a9">
     <w:name w:val="List Paragraph"/>
-    <w:basedOn w:val="Normal"/>
+    <w:basedOn w:val="a"/>
     <w:uiPriority w:val="34"/>
     <w:qFormat/>
     <w:rsid w:val="0018685D"/>
@@ -9014,9 +10097,9 @@
       <w:contextualSpacing/>
     </w:pPr>
   </w:style>
-  <w:style w:type="character" w:styleId="IntenseEmphasis">
+  <w:style w:type="character" w:styleId="aa">
     <w:name w:val="Intense Emphasis"/>
-    <w:basedOn w:val="DefaultParagraphFont"/>
+    <w:basedOn w:val="a0"/>
     <w:uiPriority w:val="21"/>
     <w:qFormat/>
     <w:rsid w:val="0018685D"/>
@@ -9026,11 +10109,11 @@
       <w:color w:val="0F4761" w:themeColor="accent1" w:themeShade="BF"/>
     </w:rPr>
   </w:style>
-  <w:style w:type="paragraph" w:styleId="IntenseQuote">
+  <w:style w:type="paragraph" w:styleId="ab">
     <w:name w:val="Intense Quote"/>
-    <w:basedOn w:val="Normal"/>
-    <w:next w:val="Normal"/>
-    <w:link w:val="IntenseQuoteChar"/>
+    <w:basedOn w:val="a"/>
+    <w:next w:val="a"/>
+    <w:link w:val="ac"/>
     <w:uiPriority w:val="30"/>
     <w:qFormat/>
     <w:rsid w:val="0018685D"/>
@@ -9049,10 +10132,10 @@
       <w:color w:val="0F4761" w:themeColor="accent1" w:themeShade="BF"/>
     </w:rPr>
   </w:style>
-  <w:style w:type="character" w:customStyle="1" w:styleId="IntenseQuoteChar">
-    <w:name w:val="Intense Quote Char"/>
-    <w:basedOn w:val="DefaultParagraphFont"/>
-    <w:link w:val="IntenseQuote"/>
+  <w:style w:type="character" w:customStyle="1" w:styleId="ac">
+    <w:name w:val="鮮明引文 字元"/>
+    <w:basedOn w:val="a0"/>
+    <w:link w:val="ab"/>
     <w:uiPriority w:val="30"/>
     <w:rsid w:val="0018685D"/>
     <w:rPr>
@@ -9061,9 +10144,9 @@
       <w:color w:val="0F4761" w:themeColor="accent1" w:themeShade="BF"/>
     </w:rPr>
   </w:style>
-  <w:style w:type="character" w:styleId="IntenseReference">
+  <w:style w:type="character" w:styleId="ad">
     <w:name w:val="Intense Reference"/>
-    <w:basedOn w:val="DefaultParagraphFont"/>
+    <w:basedOn w:val="a0"/>
     <w:uiPriority w:val="32"/>
     <w:qFormat/>
     <w:rsid w:val="0018685D"/>
@@ -9075,9 +10158,9 @@
       <w:spacing w:val="5"/>
     </w:rPr>
   </w:style>
-  <w:style w:type="paragraph" w:styleId="NormalWeb">
+  <w:style w:type="paragraph" w:styleId="Web">
     <w:name w:val="Normal (Web)"/>
-    <w:basedOn w:val="Normal"/>
+    <w:basedOn w:val="a"/>
     <w:uiPriority w:val="99"/>
     <w:semiHidden/>
     <w:unhideWhenUsed/>
@@ -9094,10 +10177,10 @@
       <w14:ligatures w14:val="none"/>
     </w:rPr>
   </w:style>
-  <w:style w:type="paragraph" w:styleId="Header">
+  <w:style w:type="paragraph" w:styleId="ae">
     <w:name w:val="header"/>
-    <w:basedOn w:val="Normal"/>
-    <w:link w:val="HeaderChar"/>
+    <w:basedOn w:val="a"/>
+    <w:link w:val="af"/>
     <w:uiPriority w:val="99"/>
     <w:unhideWhenUsed/>
     <w:rsid w:val="00B11B3A"/>
@@ -9109,17 +10192,17 @@
       <w:spacing w:after="0" w:line="240" w:lineRule="auto"/>
     </w:pPr>
   </w:style>
-  <w:style w:type="character" w:customStyle="1" w:styleId="HeaderChar">
-    <w:name w:val="Header Char"/>
-    <w:basedOn w:val="DefaultParagraphFont"/>
-    <w:link w:val="Header"/>
+  <w:style w:type="character" w:customStyle="1" w:styleId="af">
+    <w:name w:val="頁首 字元"/>
+    <w:basedOn w:val="a0"/>
+    <w:link w:val="ae"/>
     <w:uiPriority w:val="99"/>
     <w:rsid w:val="00B11B3A"/>
   </w:style>
-  <w:style w:type="paragraph" w:styleId="Footer">
+  <w:style w:type="paragraph" w:styleId="af0">
     <w:name w:val="footer"/>
-    <w:basedOn w:val="Normal"/>
-    <w:link w:val="FooterChar"/>
+    <w:basedOn w:val="a"/>
+    <w:link w:val="af1"/>
     <w:uiPriority w:val="99"/>
     <w:unhideWhenUsed/>
     <w:rsid w:val="00B11B3A"/>
@@ -9131,12 +10214,35 @@
       <w:spacing w:after="0" w:line="240" w:lineRule="auto"/>
     </w:pPr>
   </w:style>
-  <w:style w:type="character" w:customStyle="1" w:styleId="FooterChar">
-    <w:name w:val="Footer Char"/>
-    <w:basedOn w:val="DefaultParagraphFont"/>
-    <w:link w:val="Footer"/>
+  <w:style w:type="character" w:customStyle="1" w:styleId="af1">
+    <w:name w:val="頁尾 字元"/>
+    <w:basedOn w:val="a0"/>
+    <w:link w:val="af0"/>
     <w:uiPriority w:val="99"/>
     <w:rsid w:val="00B11B3A"/>
+  </w:style>
+  <w:style w:type="character" w:styleId="af2">
+    <w:name w:val="Hyperlink"/>
+    <w:basedOn w:val="a0"/>
+    <w:uiPriority w:val="99"/>
+    <w:unhideWhenUsed/>
+    <w:rsid w:val="00A3010E"/>
+    <w:rPr>
+      <w:color w:val="467886" w:themeColor="hyperlink"/>
+      <w:u w:val="single"/>
+    </w:rPr>
+  </w:style>
+  <w:style w:type="character" w:styleId="af3">
+    <w:name w:val="Unresolved Mention"/>
+    <w:basedOn w:val="a0"/>
+    <w:uiPriority w:val="99"/>
+    <w:semiHidden/>
+    <w:unhideWhenUsed/>
+    <w:rsid w:val="00A3010E"/>
+    <w:rPr>
+      <w:color w:val="605E5C"/>
+      <w:shd w:val="clear" w:color="auto" w:fill="E1DFDD"/>
+    </w:rPr>
   </w:style>
 </w:styles>
 </file>

</xml_diff>